<commit_message>
Expand PI literature synthesis to 26 sources
</commit_message>
<xml_diff>
--- a/deliverables/PI_Literature_Synthesis_Outdoor_Sensor_Box.docx
+++ b/deliverables/PI_Literature_Synthesis_Outdoor_Sensor_Box.docx
@@ -47,7 +47,7 @@
           <w:color w:val="667085"/>
           <w:sz w:val="24"/>
         </w:rPr>
-        <w:t>Summary of the 19 research sources currently included in the Enclosure-Research repository</w:t>
+        <w:t>26-source synthesis: the 23-source base plus 3 field-reliability and data-yield additions</w:t>
       </w:r>
     </w:p>
     <w:tbl>
@@ -209,7 +209,7 @@
                 <w:color w:val="000000"/>
                 <w:sz w:val="19"/>
               </w:rPr>
-              <w:t>June 11, 2026</w:t>
+              <w:t>July 27, 2026</w:t>
             </w:r>
           </w:p>
         </w:tc>
@@ -296,6 +296,22 @@
     </w:p>
     <w:p>
       <w:pPr>
+        <w:keepNext w:val="0"/>
+        <w:spacing w:after="140" w:line="264" w:lineRule="auto"/>
+      </w:pPr>
+      <w:r>
+        <w:rPr>
+          <w:rFonts w:ascii="Calibri" w:hAnsi="Calibri"/>
+          <w:b w:val="0"/>
+          <w:i w:val="0"/>
+          <w:color w:val="000000"/>
+          <w:sz w:val="21"/>
+        </w:rPr>
+        <w:t>This update preserves the 23-source base (19 research papers and four standards or protocols) and adds three field-reliability studies. Together they anchor siting, metrics, completeness, deployment records, and failure analysis.</w:t>
+      </w:r>
+    </w:p>
+    <w:p>
+      <w:pPr>
         <w:pStyle w:val="Heading2"/>
         <w:keepNext/>
       </w:pPr>
@@ -628,11 +644,6 @@
       </w:r>
     </w:p>
     <w:p>
-      <w:r>
-        <w:br w:type="page"/>
-      </w:r>
-    </w:p>
-    <w:p>
       <w:pPr>
         <w:pStyle w:val="Heading1"/>
         <w:keepNext/>
@@ -654,7 +665,7 @@
           <w:color w:val="667085"/>
           <w:sz w:val="19"/>
         </w:rPr>
-        <w:t>The table below identifies the primary contribution of each source. Detailed source profiles follow.</w:t>
+        <w:t>The table below identifies the primary contribution of all 26 sources: the 23-source base followed by three field-reliability and data-yield additions. Detailed source profiles follow.</w:t>
       </w:r>
     </w:p>
     <w:tbl>
@@ -1077,7 +1088,7 @@
                 <w:color w:val="000000"/>
                 <w:sz w:val="15"/>
               </w:rPr>
-              <w:t>Grimsley et al. (2022)</w:t>
+              <w:t>Grimsley et al. (2021)</w:t>
             </w:r>
           </w:p>
         </w:tc>
@@ -2994,6 +3005,820 @@
           </w:p>
         </w:tc>
       </w:tr>
+      <w:tr>
+        <w:tc>
+          <w:tcPr>
+            <w:tcW w:type="dxa" w:w="648"/>
+            <w:tcMar>
+              <w:top w:w="70" w:type="dxa"/>
+              <w:start w:w="120" w:type="dxa"/>
+              <w:bottom w:w="70" w:type="dxa"/>
+              <w:end w:w="120" w:type="dxa"/>
+            </w:tcMar>
+            <w:vAlign w:val="center"/>
+            <w:shd w:fill="F2F4F7"/>
+          </w:tcPr>
+          <w:p>
+            <w:pPr>
+              <w:spacing w:after="0"/>
+              <w:jc w:val="center"/>
+            </w:pPr>
+            <w:r>
+              <w:rPr>
+                <w:rFonts w:ascii="Calibri" w:hAnsi="Calibri"/>
+                <w:b w:val="0"/>
+                <w:i w:val="0"/>
+                <w:color w:val="000000"/>
+                <w:sz w:val="15"/>
+              </w:rPr>
+              <w:t>20</w:t>
+            </w:r>
+          </w:p>
+        </w:tc>
+        <w:tc>
+          <w:tcPr>
+            <w:tcW w:type="dxa" w:w="3096"/>
+            <w:tcMar>
+              <w:top w:w="70" w:type="dxa"/>
+              <w:start w:w="120" w:type="dxa"/>
+              <w:bottom w:w="70" w:type="dxa"/>
+              <w:end w:w="120" w:type="dxa"/>
+            </w:tcMar>
+            <w:vAlign w:val="center"/>
+            <w:shd w:fill="F2F4F7"/>
+          </w:tcPr>
+          <w:p>
+            <w:pPr>
+              <w:spacing w:after="0"/>
+              <w:jc w:val="left"/>
+            </w:pPr>
+            <w:r>
+              <w:rPr>
+                <w:rFonts w:ascii="Calibri" w:hAnsi="Calibri"/>
+                <w:b w:val="0"/>
+                <w:i w:val="0"/>
+                <w:color w:val="000000"/>
+                <w:sz w:val="15"/>
+              </w:rPr>
+              <w:t>Duvall et al. (2021; EPA/600/R-20/280)</w:t>
+            </w:r>
+          </w:p>
+        </w:tc>
+        <w:tc>
+          <w:tcPr>
+            <w:tcW w:type="dxa" w:w="2520"/>
+            <w:tcMar>
+              <w:top w:w="70" w:type="dxa"/>
+              <w:start w:w="120" w:type="dxa"/>
+              <w:bottom w:w="70" w:type="dxa"/>
+              <w:end w:w="120" w:type="dxa"/>
+            </w:tcMar>
+            <w:vAlign w:val="center"/>
+            <w:shd w:fill="F2F4F7"/>
+          </w:tcPr>
+          <w:p>
+            <w:pPr>
+              <w:spacing w:after="0"/>
+              <w:jc w:val="left"/>
+            </w:pPr>
+            <w:r>
+              <w:rPr>
+                <w:rFonts w:ascii="Calibri" w:hAnsi="Calibri"/>
+                <w:b w:val="0"/>
+                <w:i w:val="0"/>
+                <w:color w:val="000000"/>
+                <w:sz w:val="15"/>
+              </w:rPr>
+              <w:t>Protocol / evaluation standard</w:t>
+            </w:r>
+          </w:p>
+        </w:tc>
+        <w:tc>
+          <w:tcPr>
+            <w:tcW w:type="dxa" w:w="2952"/>
+            <w:tcMar>
+              <w:top w:w="70" w:type="dxa"/>
+              <w:start w:w="120" w:type="dxa"/>
+              <w:bottom w:w="70" w:type="dxa"/>
+              <w:end w:w="120" w:type="dxa"/>
+            </w:tcMar>
+            <w:vAlign w:val="center"/>
+            <w:shd w:fill="F2F4F7"/>
+          </w:tcPr>
+          <w:p>
+            <w:pPr>
+              <w:spacing w:after="0"/>
+              <w:jc w:val="left"/>
+            </w:pPr>
+            <w:r>
+              <w:rPr>
+                <w:rFonts w:ascii="Calibri" w:hAnsi="Calibri"/>
+                <w:b w:val="0"/>
+                <w:i w:val="0"/>
+                <w:color w:val="000000"/>
+                <w:sz w:val="15"/>
+              </w:rPr>
+              <w:t>The protocol supplies a repeatable PM2.5 performance framework, but it does not certify a sensor or justify enclosure design choices.</w:t>
+            </w:r>
+          </w:p>
+        </w:tc>
+      </w:tr>
+      <w:tr>
+        <w:tc>
+          <w:tcPr>
+            <w:tcW w:type="dxa" w:w="648"/>
+            <w:tcMar>
+              <w:top w:w="70" w:type="dxa"/>
+              <w:start w:w="120" w:type="dxa"/>
+              <w:bottom w:w="70" w:type="dxa"/>
+              <w:end w:w="120" w:type="dxa"/>
+            </w:tcMar>
+            <w:vAlign w:val="center"/>
+          </w:tcPr>
+          <w:p>
+            <w:pPr>
+              <w:spacing w:after="0"/>
+              <w:jc w:val="center"/>
+            </w:pPr>
+            <w:r>
+              <w:rPr>
+                <w:rFonts w:ascii="Calibri" w:hAnsi="Calibri"/>
+                <w:b w:val="0"/>
+                <w:i w:val="0"/>
+                <w:color w:val="000000"/>
+                <w:sz w:val="15"/>
+              </w:rPr>
+              <w:t>21</w:t>
+            </w:r>
+          </w:p>
+        </w:tc>
+        <w:tc>
+          <w:tcPr>
+            <w:tcW w:type="dxa" w:w="3096"/>
+            <w:tcMar>
+              <w:top w:w="70" w:type="dxa"/>
+              <w:start w:w="120" w:type="dxa"/>
+              <w:bottom w:w="70" w:type="dxa"/>
+              <w:end w:w="120" w:type="dxa"/>
+            </w:tcMar>
+            <w:vAlign w:val="center"/>
+          </w:tcPr>
+          <w:p>
+            <w:pPr>
+              <w:spacing w:after="0"/>
+              <w:jc w:val="left"/>
+            </w:pPr>
+            <w:r>
+              <w:rPr>
+                <w:rFonts w:ascii="Calibri" w:hAnsi="Calibri"/>
+                <w:b w:val="0"/>
+                <w:i w:val="0"/>
+                <w:color w:val="000000"/>
+                <w:sz w:val="15"/>
+              </w:rPr>
+              <w:t>World Meteorological Organization (2023)</w:t>
+            </w:r>
+          </w:p>
+        </w:tc>
+        <w:tc>
+          <w:tcPr>
+            <w:tcW w:type="dxa" w:w="2520"/>
+            <w:tcMar>
+              <w:top w:w="70" w:type="dxa"/>
+              <w:start w:w="120" w:type="dxa"/>
+              <w:bottom w:w="70" w:type="dxa"/>
+              <w:end w:w="120" w:type="dxa"/>
+            </w:tcMar>
+            <w:vAlign w:val="center"/>
+          </w:tcPr>
+          <w:p>
+            <w:pPr>
+              <w:spacing w:after="0"/>
+              <w:jc w:val="left"/>
+            </w:pPr>
+            <w:r>
+              <w:rPr>
+                <w:rFonts w:ascii="Calibri" w:hAnsi="Calibri"/>
+                <w:b w:val="0"/>
+                <w:i w:val="0"/>
+                <w:color w:val="000000"/>
+                <w:sz w:val="15"/>
+              </w:rPr>
+              <w:t>Protocol / evaluation standard</w:t>
+            </w:r>
+          </w:p>
+        </w:tc>
+        <w:tc>
+          <w:tcPr>
+            <w:tcW w:type="dxa" w:w="2952"/>
+            <w:tcMar>
+              <w:top w:w="70" w:type="dxa"/>
+              <w:start w:w="120" w:type="dxa"/>
+              <w:bottom w:w="70" w:type="dxa"/>
+              <w:end w:w="120" w:type="dxa"/>
+            </w:tcMar>
+            <w:vAlign w:val="center"/>
+          </w:tcPr>
+          <w:p>
+            <w:pPr>
+              <w:spacing w:after="0"/>
+              <w:jc w:val="left"/>
+            </w:pPr>
+            <w:r>
+              <w:rPr>
+                <w:rFonts w:ascii="Calibri" w:hAnsi="Calibri"/>
+                <w:b w:val="0"/>
+                <w:i w:val="0"/>
+                <w:color w:val="000000"/>
+                <w:sz w:val="15"/>
+              </w:rPr>
+              <w:t>WMO practice defines the measurement target and reference context, but not a specific low-cost enclosure solution.</w:t>
+            </w:r>
+          </w:p>
+        </w:tc>
+      </w:tr>
+      <w:tr>
+        <w:tc>
+          <w:tcPr>
+            <w:tcW w:type="dxa" w:w="648"/>
+            <w:tcMar>
+              <w:top w:w="70" w:type="dxa"/>
+              <w:start w:w="120" w:type="dxa"/>
+              <w:bottom w:w="70" w:type="dxa"/>
+              <w:end w:w="120" w:type="dxa"/>
+            </w:tcMar>
+            <w:vAlign w:val="center"/>
+            <w:shd w:fill="F2F4F7"/>
+          </w:tcPr>
+          <w:p>
+            <w:pPr>
+              <w:spacing w:after="0"/>
+              <w:jc w:val="center"/>
+            </w:pPr>
+            <w:r>
+              <w:rPr>
+                <w:rFonts w:ascii="Calibri" w:hAnsi="Calibri"/>
+                <w:b w:val="0"/>
+                <w:i w:val="0"/>
+                <w:color w:val="000000"/>
+                <w:sz w:val="15"/>
+              </w:rPr>
+              <w:t>22</w:t>
+            </w:r>
+          </w:p>
+        </w:tc>
+        <w:tc>
+          <w:tcPr>
+            <w:tcW w:type="dxa" w:w="3096"/>
+            <w:tcMar>
+              <w:top w:w="70" w:type="dxa"/>
+              <w:start w:w="120" w:type="dxa"/>
+              <w:bottom w:w="70" w:type="dxa"/>
+              <w:end w:w="120" w:type="dxa"/>
+            </w:tcMar>
+            <w:vAlign w:val="center"/>
+            <w:shd w:fill="F2F4F7"/>
+          </w:tcPr>
+          <w:p>
+            <w:pPr>
+              <w:spacing w:after="0"/>
+              <w:jc w:val="left"/>
+            </w:pPr>
+            <w:r>
+              <w:rPr>
+                <w:rFonts w:ascii="Calibri" w:hAnsi="Calibri"/>
+                <w:b w:val="0"/>
+                <w:i w:val="0"/>
+                <w:color w:val="000000"/>
+                <w:sz w:val="15"/>
+              </w:rPr>
+              <w:t>ASTM International (2022)</w:t>
+            </w:r>
+          </w:p>
+        </w:tc>
+        <w:tc>
+          <w:tcPr>
+            <w:tcW w:type="dxa" w:w="2520"/>
+            <w:tcMar>
+              <w:top w:w="70" w:type="dxa"/>
+              <w:start w:w="120" w:type="dxa"/>
+              <w:bottom w:w="70" w:type="dxa"/>
+              <w:end w:w="120" w:type="dxa"/>
+            </w:tcMar>
+            <w:vAlign w:val="center"/>
+            <w:shd w:fill="F2F4F7"/>
+          </w:tcPr>
+          <w:p>
+            <w:pPr>
+              <w:spacing w:after="0"/>
+              <w:jc w:val="left"/>
+            </w:pPr>
+            <w:r>
+              <w:rPr>
+                <w:rFonts w:ascii="Calibri" w:hAnsi="Calibri"/>
+                <w:b w:val="0"/>
+                <w:i w:val="0"/>
+                <w:color w:val="000000"/>
+                <w:sz w:val="15"/>
+              </w:rPr>
+              <w:t>Protocol / evaluation standard</w:t>
+            </w:r>
+          </w:p>
+        </w:tc>
+        <w:tc>
+          <w:tcPr>
+            <w:tcW w:type="dxa" w:w="2952"/>
+            <w:tcMar>
+              <w:top w:w="70" w:type="dxa"/>
+              <w:start w:w="120" w:type="dxa"/>
+              <w:bottom w:w="70" w:type="dxa"/>
+              <w:end w:w="120" w:type="dxa"/>
+            </w:tcMar>
+            <w:vAlign w:val="center"/>
+            <w:shd w:fill="F2F4F7"/>
+          </w:tcPr>
+          <w:p>
+            <w:pPr>
+              <w:spacing w:after="0"/>
+              <w:jc w:val="left"/>
+            </w:pPr>
+            <w:r>
+              <w:rPr>
+                <w:rFonts w:ascii="Calibri" w:hAnsi="Calibri"/>
+                <w:b w:val="0"/>
+                <w:i w:val="0"/>
+                <w:color w:val="000000"/>
+                <w:sz w:val="15"/>
+              </w:rPr>
+              <w:t>ASTM D8406-22 strengthens the methods basis for gas and PM evaluation but cannot support enclosure claims from its public scope alone.</w:t>
+            </w:r>
+          </w:p>
+        </w:tc>
+      </w:tr>
+      <w:tr>
+        <w:tc>
+          <w:tcPr>
+            <w:tcW w:type="dxa" w:w="648"/>
+            <w:tcMar>
+              <w:top w:w="70" w:type="dxa"/>
+              <w:start w:w="120" w:type="dxa"/>
+              <w:bottom w:w="70" w:type="dxa"/>
+              <w:end w:w="120" w:type="dxa"/>
+            </w:tcMar>
+            <w:vAlign w:val="center"/>
+          </w:tcPr>
+          <w:p>
+            <w:pPr>
+              <w:spacing w:after="0"/>
+              <w:jc w:val="center"/>
+            </w:pPr>
+            <w:r>
+              <w:rPr>
+                <w:rFonts w:ascii="Calibri" w:hAnsi="Calibri"/>
+                <w:b w:val="0"/>
+                <w:i w:val="0"/>
+                <w:color w:val="000000"/>
+                <w:sz w:val="15"/>
+              </w:rPr>
+              <w:t>23</w:t>
+            </w:r>
+          </w:p>
+        </w:tc>
+        <w:tc>
+          <w:tcPr>
+            <w:tcW w:type="dxa" w:w="3096"/>
+            <w:tcMar>
+              <w:top w:w="70" w:type="dxa"/>
+              <w:start w:w="120" w:type="dxa"/>
+              <w:bottom w:w="70" w:type="dxa"/>
+              <w:end w:w="120" w:type="dxa"/>
+            </w:tcMar>
+            <w:vAlign w:val="center"/>
+          </w:tcPr>
+          <w:p>
+            <w:pPr>
+              <w:spacing w:after="0"/>
+              <w:jc w:val="left"/>
+            </w:pPr>
+            <w:r>
+              <w:rPr>
+                <w:rFonts w:ascii="Calibri" w:hAnsi="Calibri"/>
+                <w:b w:val="0"/>
+                <w:i w:val="0"/>
+                <w:color w:val="000000"/>
+                <w:sz w:val="15"/>
+              </w:rPr>
+              <w:t>European Committee for Standardization (2021)</w:t>
+            </w:r>
+          </w:p>
+        </w:tc>
+        <w:tc>
+          <w:tcPr>
+            <w:tcW w:type="dxa" w:w="2520"/>
+            <w:tcMar>
+              <w:top w:w="70" w:type="dxa"/>
+              <w:start w:w="120" w:type="dxa"/>
+              <w:bottom w:w="70" w:type="dxa"/>
+              <w:end w:w="120" w:type="dxa"/>
+            </w:tcMar>
+            <w:vAlign w:val="center"/>
+          </w:tcPr>
+          <w:p>
+            <w:pPr>
+              <w:spacing w:after="0"/>
+              <w:jc w:val="left"/>
+            </w:pPr>
+            <w:r>
+              <w:rPr>
+                <w:rFonts w:ascii="Calibri" w:hAnsi="Calibri"/>
+                <w:b w:val="0"/>
+                <w:i w:val="0"/>
+                <w:color w:val="000000"/>
+                <w:sz w:val="15"/>
+              </w:rPr>
+              <w:t>Protocol / evaluation standard</w:t>
+            </w:r>
+          </w:p>
+        </w:tc>
+        <w:tc>
+          <w:tcPr>
+            <w:tcW w:type="dxa" w:w="2952"/>
+            <w:tcMar>
+              <w:top w:w="70" w:type="dxa"/>
+              <w:start w:w="120" w:type="dxa"/>
+              <w:bottom w:w="70" w:type="dxa"/>
+              <w:end w:w="120" w:type="dxa"/>
+            </w:tcMar>
+            <w:vAlign w:val="center"/>
+          </w:tcPr>
+          <w:p>
+            <w:pPr>
+              <w:spacing w:after="0"/>
+              <w:jc w:val="left"/>
+            </w:pPr>
+            <w:r>
+              <w:rPr>
+                <w:rFonts w:ascii="Calibri" w:hAnsi="Calibri"/>
+                <w:b w:val="0"/>
+                <w:i w:val="0"/>
+                <w:color w:val="000000"/>
+                <w:sz w:val="15"/>
+              </w:rPr>
+              <w:t>The specification supports class-based gas-sensor evaluation but does not justify physical enclosure choices.</w:t>
+            </w:r>
+          </w:p>
+        </w:tc>
+      </w:tr>
+      <w:tr>
+        <w:tc>
+          <w:tcPr>
+            <w:tcW w:type="dxa" w:w="648"/>
+            <w:tcMar>
+              <w:top w:w="70" w:type="dxa"/>
+              <w:start w:w="120" w:type="dxa"/>
+              <w:bottom w:w="70" w:type="dxa"/>
+              <w:end w:w="120" w:type="dxa"/>
+            </w:tcMar>
+            <w:vAlign w:val="center"/>
+            <w:shd w:fill="F2F4F7"/>
+          </w:tcPr>
+          <w:p>
+            <w:pPr>
+              <w:spacing w:after="0"/>
+              <w:jc w:val="center"/>
+            </w:pPr>
+            <w:r>
+              <w:rPr>
+                <w:rFonts w:ascii="Calibri" w:hAnsi="Calibri"/>
+                <w:b w:val="0"/>
+                <w:i w:val="0"/>
+                <w:color w:val="000000"/>
+                <w:sz w:val="15"/>
+              </w:rPr>
+              <w:t>24</w:t>
+            </w:r>
+          </w:p>
+        </w:tc>
+        <w:tc>
+          <w:tcPr>
+            <w:tcW w:type="dxa" w:w="3096"/>
+            <w:tcMar>
+              <w:top w:w="70" w:type="dxa"/>
+              <w:start w:w="120" w:type="dxa"/>
+              <w:bottom w:w="70" w:type="dxa"/>
+              <w:end w:w="120" w:type="dxa"/>
+            </w:tcMar>
+            <w:vAlign w:val="center"/>
+            <w:shd w:fill="F2F4F7"/>
+          </w:tcPr>
+          <w:p>
+            <w:pPr>
+              <w:spacing w:after="0"/>
+              <w:jc w:val="left"/>
+            </w:pPr>
+            <w:r>
+              <w:rPr>
+                <w:rFonts w:ascii="Calibri" w:hAnsi="Calibri"/>
+                <w:b w:val="0"/>
+                <w:i w:val="0"/>
+                <w:color w:val="000000"/>
+                <w:sz w:val="15"/>
+              </w:rPr>
+              <w:t>Szewczyk et al. (2004)</w:t>
+            </w:r>
+          </w:p>
+        </w:tc>
+        <w:tc>
+          <w:tcPr>
+            <w:tcW w:type="dxa" w:w="2520"/>
+            <w:tcMar>
+              <w:top w:w="70" w:type="dxa"/>
+              <w:start w:w="120" w:type="dxa"/>
+              <w:bottom w:w="70" w:type="dxa"/>
+              <w:end w:w="120" w:type="dxa"/>
+            </w:tcMar>
+            <w:vAlign w:val="center"/>
+            <w:shd w:fill="F2F4F7"/>
+          </w:tcPr>
+          <w:p>
+            <w:pPr>
+              <w:spacing w:after="0"/>
+              <w:jc w:val="left"/>
+            </w:pPr>
+            <w:r>
+              <w:rPr>
+                <w:rFonts w:ascii="Calibri" w:hAnsi="Calibri"/>
+                <w:b w:val="0"/>
+                <w:i w:val="0"/>
+                <w:color w:val="000000"/>
+                <w:sz w:val="15"/>
+              </w:rPr>
+              <w:t>Field reliability / data yield</w:t>
+            </w:r>
+          </w:p>
+        </w:tc>
+        <w:tc>
+          <w:tcPr>
+            <w:tcW w:type="dxa" w:w="2952"/>
+            <w:tcMar>
+              <w:top w:w="70" w:type="dxa"/>
+              <w:start w:w="120" w:type="dxa"/>
+              <w:bottom w:w="70" w:type="dxa"/>
+              <w:end w:w="120" w:type="dxa"/>
+            </w:tcMar>
+            <w:vAlign w:val="center"/>
+            <w:shd w:fill="F2F4F7"/>
+          </w:tcPr>
+          <w:p>
+            <w:pPr>
+              <w:spacing w:after="0"/>
+              <w:jc w:val="left"/>
+            </w:pPr>
+            <w:r>
+              <w:rPr>
+                <w:rFonts w:ascii="Calibri" w:hAnsi="Calibri"/>
+                <w:b w:val="0"/>
+                <w:i w:val="0"/>
+                <w:color w:val="000000"/>
+                <w:sz w:val="15"/>
+              </w:rPr>
+              <w:t>Deployment reliability and completeness can limit scientific value even when individual sensors function as expected.</w:t>
+            </w:r>
+          </w:p>
+        </w:tc>
+      </w:tr>
+      <w:tr>
+        <w:tc>
+          <w:tcPr>
+            <w:tcW w:type="dxa" w:w="648"/>
+            <w:tcMar>
+              <w:top w:w="70" w:type="dxa"/>
+              <w:start w:w="120" w:type="dxa"/>
+              <w:bottom w:w="70" w:type="dxa"/>
+              <w:end w:w="120" w:type="dxa"/>
+            </w:tcMar>
+            <w:vAlign w:val="center"/>
+          </w:tcPr>
+          <w:p>
+            <w:pPr>
+              <w:spacing w:after="0"/>
+              <w:jc w:val="center"/>
+            </w:pPr>
+            <w:r>
+              <w:rPr>
+                <w:rFonts w:ascii="Calibri" w:hAnsi="Calibri"/>
+                <w:b w:val="0"/>
+                <w:i w:val="0"/>
+                <w:color w:val="000000"/>
+                <w:sz w:val="15"/>
+              </w:rPr>
+              <w:t>25</w:t>
+            </w:r>
+          </w:p>
+        </w:tc>
+        <w:tc>
+          <w:tcPr>
+            <w:tcW w:type="dxa" w:w="3096"/>
+            <w:tcMar>
+              <w:top w:w="70" w:type="dxa"/>
+              <w:start w:w="120" w:type="dxa"/>
+              <w:bottom w:w="70" w:type="dxa"/>
+              <w:end w:w="120" w:type="dxa"/>
+            </w:tcMar>
+            <w:vAlign w:val="center"/>
+          </w:tcPr>
+          <w:p>
+            <w:pPr>
+              <w:spacing w:after="0"/>
+              <w:jc w:val="left"/>
+            </w:pPr>
+            <w:r>
+              <w:rPr>
+                <w:rFonts w:ascii="Calibri" w:hAnsi="Calibri"/>
+                <w:b w:val="0"/>
+                <w:i w:val="0"/>
+                <w:color w:val="000000"/>
+                <w:sz w:val="15"/>
+              </w:rPr>
+              <w:t>Barrenetxea et al. (2008)</w:t>
+            </w:r>
+          </w:p>
+        </w:tc>
+        <w:tc>
+          <w:tcPr>
+            <w:tcW w:type="dxa" w:w="2520"/>
+            <w:tcMar>
+              <w:top w:w="70" w:type="dxa"/>
+              <w:start w:w="120" w:type="dxa"/>
+              <w:bottom w:w="70" w:type="dxa"/>
+              <w:end w:w="120" w:type="dxa"/>
+            </w:tcMar>
+            <w:vAlign w:val="center"/>
+          </w:tcPr>
+          <w:p>
+            <w:pPr>
+              <w:spacing w:after="0"/>
+              <w:jc w:val="left"/>
+            </w:pPr>
+            <w:r>
+              <w:rPr>
+                <w:rFonts w:ascii="Calibri" w:hAnsi="Calibri"/>
+                <w:b w:val="0"/>
+                <w:i w:val="0"/>
+                <w:color w:val="000000"/>
+                <w:sz w:val="15"/>
+              </w:rPr>
+              <w:t>Field reliability / data yield</w:t>
+            </w:r>
+          </w:p>
+        </w:tc>
+        <w:tc>
+          <w:tcPr>
+            <w:tcW w:type="dxa" w:w="2952"/>
+            <w:tcMar>
+              <w:top w:w="70" w:type="dxa"/>
+              <w:start w:w="120" w:type="dxa"/>
+              <w:bottom w:w="70" w:type="dxa"/>
+              <w:end w:w="120" w:type="dxa"/>
+            </w:tcMar>
+            <w:vAlign w:val="center"/>
+          </w:tcPr>
+          <w:p>
+            <w:pPr>
+              <w:spacing w:after="0"/>
+              <w:jc w:val="left"/>
+            </w:pPr>
+            <w:r>
+              <w:rPr>
+                <w:rFonts w:ascii="Calibri" w:hAnsi="Calibri"/>
+                <w:b w:val="0"/>
+                <w:i w:val="0"/>
+                <w:color w:val="000000"/>
+                <w:sz w:val="15"/>
+              </w:rPr>
+              <w:t>Protocol discipline and field-realistic pre-deployment checks are essential to interpreting sensor-network results.</w:t>
+            </w:r>
+          </w:p>
+        </w:tc>
+      </w:tr>
+      <w:tr>
+        <w:tc>
+          <w:tcPr>
+            <w:tcW w:type="dxa" w:w="648"/>
+            <w:tcMar>
+              <w:top w:w="70" w:type="dxa"/>
+              <w:start w:w="120" w:type="dxa"/>
+              <w:bottom w:w="70" w:type="dxa"/>
+              <w:end w:w="120" w:type="dxa"/>
+            </w:tcMar>
+            <w:vAlign w:val="center"/>
+            <w:shd w:fill="F2F4F7"/>
+          </w:tcPr>
+          <w:p>
+            <w:pPr>
+              <w:spacing w:after="0"/>
+              <w:jc w:val="center"/>
+            </w:pPr>
+            <w:r>
+              <w:rPr>
+                <w:rFonts w:ascii="Calibri" w:hAnsi="Calibri"/>
+                <w:b w:val="0"/>
+                <w:i w:val="0"/>
+                <w:color w:val="000000"/>
+                <w:sz w:val="15"/>
+              </w:rPr>
+              <w:t>26</w:t>
+            </w:r>
+          </w:p>
+        </w:tc>
+        <w:tc>
+          <w:tcPr>
+            <w:tcW w:type="dxa" w:w="3096"/>
+            <w:tcMar>
+              <w:top w:w="70" w:type="dxa"/>
+              <w:start w:w="120" w:type="dxa"/>
+              <w:bottom w:w="70" w:type="dxa"/>
+              <w:end w:w="120" w:type="dxa"/>
+            </w:tcMar>
+            <w:vAlign w:val="center"/>
+            <w:shd w:fill="F2F4F7"/>
+          </w:tcPr>
+          <w:p>
+            <w:pPr>
+              <w:spacing w:after="0"/>
+              <w:jc w:val="left"/>
+            </w:pPr>
+            <w:r>
+              <w:rPr>
+                <w:rFonts w:ascii="Calibri" w:hAnsi="Calibri"/>
+                <w:b w:val="0"/>
+                <w:i w:val="0"/>
+                <w:color w:val="000000"/>
+                <w:sz w:val="15"/>
+              </w:rPr>
+              <w:t>Feinberg et al. (2018)</w:t>
+            </w:r>
+          </w:p>
+        </w:tc>
+        <w:tc>
+          <w:tcPr>
+            <w:tcW w:type="dxa" w:w="2520"/>
+            <w:tcMar>
+              <w:top w:w="70" w:type="dxa"/>
+              <w:start w:w="120" w:type="dxa"/>
+              <w:bottom w:w="70" w:type="dxa"/>
+              <w:end w:w="120" w:type="dxa"/>
+            </w:tcMar>
+            <w:vAlign w:val="center"/>
+            <w:shd w:fill="F2F4F7"/>
+          </w:tcPr>
+          <w:p>
+            <w:pPr>
+              <w:spacing w:after="0"/>
+              <w:jc w:val="left"/>
+            </w:pPr>
+            <w:r>
+              <w:rPr>
+                <w:rFonts w:ascii="Calibri" w:hAnsi="Calibri"/>
+                <w:b w:val="0"/>
+                <w:i w:val="0"/>
+                <w:color w:val="000000"/>
+                <w:sz w:val="15"/>
+              </w:rPr>
+              <w:t>Field reliability / data yield</w:t>
+            </w:r>
+          </w:p>
+        </w:tc>
+        <w:tc>
+          <w:tcPr>
+            <w:tcW w:type="dxa" w:w="2952"/>
+            <w:tcMar>
+              <w:top w:w="70" w:type="dxa"/>
+              <w:start w:w="120" w:type="dxa"/>
+              <w:bottom w:w="70" w:type="dxa"/>
+              <w:end w:w="120" w:type="dxa"/>
+            </w:tcMar>
+            <w:vAlign w:val="center"/>
+            <w:shd w:fill="F2F4F7"/>
+          </w:tcPr>
+          <w:p>
+            <w:pPr>
+              <w:spacing w:after="0"/>
+              <w:jc w:val="left"/>
+            </w:pPr>
+            <w:r>
+              <w:rPr>
+                <w:rFonts w:ascii="Calibri" w:hAnsi="Calibri"/>
+                <w:b w:val="0"/>
+                <w:i w:val="0"/>
+                <w:color w:val="000000"/>
+                <w:sz w:val="15"/>
+              </w:rPr>
+              <w:t>A long deployment can reveal completeness and repeatability limits that a short calibration exercise cannot.</w:t>
+            </w:r>
+          </w:p>
+        </w:tc>
+      </w:tr>
     </w:tbl>
     <w:p>
       <w:r>
@@ -3875,7 +4700,7 @@
         <w:keepNext/>
       </w:pPr>
       <w:r>
-        <w:t>3. Grimsley et al. (2022)</w:t>
+        <w:t>3. Grimsley et al. (2021)</w:t>
       </w:r>
     </w:p>
     <w:p>
@@ -11114,6 +11939,3020 @@
         <w:keepNext/>
       </w:pPr>
       <w:r>
+        <w:t>Standards and Evaluation Protocols (23-Source Base)</w:t>
+      </w:r>
+    </w:p>
+    <w:p>
+      <w:pPr>
+        <w:keepNext w:val="0"/>
+        <w:spacing w:after="120" w:line="264" w:lineRule="auto"/>
+      </w:pPr>
+      <w:r>
+        <w:rPr>
+          <w:rFonts w:ascii="Calibri" w:hAnsi="Calibri"/>
+          <w:b w:val="0"/>
+          <w:i w:val="0"/>
+          <w:color w:val="667085"/>
+          <w:sz w:val="19"/>
+        </w:rPr>
+        <w:t>These four sources complete the documented 23-source base by anchoring siting, co-location, metrics, and performance-class framing. They are standards or protocols, not experimental papers.</w:t>
+      </w:r>
+    </w:p>
+    <w:p>
+      <w:pPr>
+        <w:pStyle w:val="Heading2"/>
+        <w:keepNext/>
+      </w:pPr>
+      <w:r>
+        <w:t>20. Duvall et al. (2021; EPA/600/R-20/280)</w:t>
+      </w:r>
+    </w:p>
+    <w:p>
+      <w:pPr>
+        <w:keepNext/>
+        <w:spacing w:after="60" w:line="264" w:lineRule="auto"/>
+      </w:pPr>
+      <w:r>
+        <w:rPr>
+          <w:rFonts w:ascii="Calibri" w:hAnsi="Calibri"/>
+          <w:b w:val="0"/>
+          <w:i/>
+          <w:color w:val="17324D"/>
+          <w:sz w:val="22"/>
+        </w:rPr>
+        <w:t>Performance Testing Protocols, Metrics, and Target Values for Fine Particulate Matter Air Sensors</w:t>
+      </w:r>
+    </w:p>
+    <w:p>
+      <w:pPr>
+        <w:keepNext/>
+        <w:spacing w:after="120" w:line="264" w:lineRule="auto"/>
+      </w:pPr>
+      <w:r>
+        <w:rPr>
+          <w:rFonts w:ascii="Calibri" w:hAnsi="Calibri"/>
+          <w:b w:val="0"/>
+          <w:i w:val="0"/>
+          <w:color w:val="667085"/>
+          <w:sz w:val="17"/>
+        </w:rPr>
+        <w:t>Source: https://cfpub.epa.gov/si/si_public_record_report.cfm?dirEntryId=350785</w:t>
+      </w:r>
+    </w:p>
+    <w:tbl>
+      <w:tblPr>
+        <w:tblStyle w:val="TableGrid"/>
+        <w:tblW w:type="auto" w:w="0"/>
+        <w:jc w:val="center"/>
+        <w:tblLayout w:type="fixed"/>
+        <w:tblLook w:firstColumn="1" w:firstRow="1" w:lastColumn="0" w:lastRow="0" w:noHBand="0" w:noVBand="1" w:val="04A0"/>
+      </w:tblPr>
+      <w:tblGrid>
+        <w:gridCol w:w="4939"/>
+        <w:gridCol w:w="4939"/>
+      </w:tblGrid>
+      <w:tr>
+        <w:tc>
+          <w:tcPr>
+            <w:tcW w:type="dxa" w:w="1944"/>
+            <w:shd w:fill="EAF2F8"/>
+            <w:tcMar>
+              <w:top w:w="80" w:type="dxa"/>
+              <w:start w:w="120" w:type="dxa"/>
+              <w:bottom w:w="80" w:type="dxa"/>
+              <w:end w:w="120" w:type="dxa"/>
+            </w:tcMar>
+            <w:vAlign w:val="center"/>
+          </w:tcPr>
+          <w:p>
+            <w:pPr>
+              <w:spacing w:after="0"/>
+            </w:pPr>
+            <w:r>
+              <w:rPr>
+                <w:rFonts w:ascii="Calibri" w:hAnsi="Calibri"/>
+                <w:b/>
+                <w:i w:val="0"/>
+                <w:color w:val="17324D"/>
+                <w:sz w:val="18"/>
+              </w:rPr>
+              <w:t>Sensors</w:t>
+            </w:r>
+          </w:p>
+        </w:tc>
+        <w:tc>
+          <w:tcPr>
+            <w:tcW w:type="dxa" w:w="7272"/>
+            <w:tcMar>
+              <w:top w:w="80" w:type="dxa"/>
+              <w:start w:w="120" w:type="dxa"/>
+              <w:bottom w:w="80" w:type="dxa"/>
+              <w:end w:w="120" w:type="dxa"/>
+            </w:tcMar>
+            <w:vAlign w:val="center"/>
+          </w:tcPr>
+          <w:p>
+            <w:pPr>
+              <w:spacing w:after="0"/>
+            </w:pPr>
+            <w:r>
+              <w:rPr>
+                <w:rFonts w:ascii="Calibri" w:hAnsi="Calibri"/>
+                <w:b w:val="0"/>
+                <w:i w:val="0"/>
+                <w:color w:val="000000"/>
+                <w:sz w:val="18"/>
+              </w:rPr>
+              <w:t>No specific model; applies to PM2.5 air sensors used for ambient, outdoor, fixed-site, non-regulatory monitoring.</w:t>
+            </w:r>
+          </w:p>
+        </w:tc>
+      </w:tr>
+      <w:tr>
+        <w:tc>
+          <w:tcPr>
+            <w:tcW w:type="dxa" w:w="1944"/>
+            <w:shd w:fill="EAF2F8"/>
+            <w:tcMar>
+              <w:top w:w="80" w:type="dxa"/>
+              <w:start w:w="120" w:type="dxa"/>
+              <w:bottom w:w="80" w:type="dxa"/>
+              <w:end w:w="120" w:type="dxa"/>
+            </w:tcMar>
+            <w:vAlign w:val="center"/>
+          </w:tcPr>
+          <w:p>
+            <w:pPr>
+              <w:spacing w:after="0"/>
+            </w:pPr>
+            <w:r>
+              <w:rPr>
+                <w:rFonts w:ascii="Calibri" w:hAnsi="Calibri"/>
+                <w:b/>
+                <w:i w:val="0"/>
+                <w:color w:val="17324D"/>
+                <w:sz w:val="18"/>
+              </w:rPr>
+              <w:t>Materials</w:t>
+            </w:r>
+          </w:p>
+        </w:tc>
+        <w:tc>
+          <w:tcPr>
+            <w:tcW w:type="dxa" w:w="7272"/>
+            <w:tcMar>
+              <w:top w:w="80" w:type="dxa"/>
+              <w:start w:w="120" w:type="dxa"/>
+              <w:bottom w:w="80" w:type="dxa"/>
+              <w:end w:w="120" w:type="dxa"/>
+            </w:tcMar>
+            <w:vAlign w:val="center"/>
+          </w:tcPr>
+          <w:p>
+            <w:pPr>
+              <w:spacing w:after="0"/>
+            </w:pPr>
+            <w:r>
+              <w:rPr>
+                <w:rFonts w:ascii="Calibri" w:hAnsi="Calibri"/>
+                <w:b w:val="0"/>
+                <w:i w:val="0"/>
+                <w:color w:val="000000"/>
+                <w:sz w:val="18"/>
+              </w:rPr>
+              <w:t>Not addressed; the protocol evaluates a sensor system as a unit.</w:t>
+            </w:r>
+          </w:p>
+        </w:tc>
+      </w:tr>
+      <w:tr>
+        <w:tc>
+          <w:tcPr>
+            <w:tcW w:type="dxa" w:w="1944"/>
+            <w:shd w:fill="EAF2F8"/>
+            <w:tcMar>
+              <w:top w:w="80" w:type="dxa"/>
+              <w:start w:w="120" w:type="dxa"/>
+              <w:bottom w:w="80" w:type="dxa"/>
+              <w:end w:w="120" w:type="dxa"/>
+            </w:tcMar>
+            <w:vAlign w:val="center"/>
+          </w:tcPr>
+          <w:p>
+            <w:pPr>
+              <w:spacing w:after="0"/>
+            </w:pPr>
+            <w:r>
+              <w:rPr>
+                <w:rFonts w:ascii="Calibri" w:hAnsi="Calibri"/>
+                <w:b/>
+                <w:i w:val="0"/>
+                <w:color w:val="17324D"/>
+                <w:sz w:val="18"/>
+              </w:rPr>
+              <w:t>Geometry</w:t>
+            </w:r>
+          </w:p>
+        </w:tc>
+        <w:tc>
+          <w:tcPr>
+            <w:tcW w:type="dxa" w:w="7272"/>
+            <w:tcMar>
+              <w:top w:w="80" w:type="dxa"/>
+              <w:start w:w="120" w:type="dxa"/>
+              <w:bottom w:w="80" w:type="dxa"/>
+              <w:end w:w="120" w:type="dxa"/>
+            </w:tcMar>
+            <w:vAlign w:val="center"/>
+          </w:tcPr>
+          <w:p>
+            <w:pPr>
+              <w:spacing w:after="0"/>
+            </w:pPr>
+            <w:r>
+              <w:rPr>
+                <w:rFonts w:ascii="Calibri" w:hAnsi="Calibri"/>
+                <w:b w:val="0"/>
+                <w:i w:val="0"/>
+                <w:color w:val="000000"/>
+                <w:sz w:val="18"/>
+              </w:rPr>
+              <w:t>Not addressed; enclosure design and shielding are outside the protocol's scope.</w:t>
+            </w:r>
+          </w:p>
+        </w:tc>
+      </w:tr>
+      <w:tr>
+        <w:tc>
+          <w:tcPr>
+            <w:tcW w:type="dxa" w:w="1944"/>
+            <w:shd w:fill="EAF2F8"/>
+            <w:tcMar>
+              <w:top w:w="80" w:type="dxa"/>
+              <w:start w:w="120" w:type="dxa"/>
+              <w:bottom w:w="80" w:type="dxa"/>
+              <w:end w:w="120" w:type="dxa"/>
+            </w:tcMar>
+            <w:vAlign w:val="center"/>
+          </w:tcPr>
+          <w:p>
+            <w:pPr>
+              <w:spacing w:after="0"/>
+            </w:pPr>
+            <w:r>
+              <w:rPr>
+                <w:rFonts w:ascii="Calibri" w:hAnsi="Calibri"/>
+                <w:b/>
+                <w:i w:val="0"/>
+                <w:color w:val="17324D"/>
+                <w:sz w:val="18"/>
+              </w:rPr>
+              <w:t>Experimental setup</w:t>
+            </w:r>
+          </w:p>
+        </w:tc>
+        <w:tc>
+          <w:tcPr>
+            <w:tcW w:type="dxa" w:w="7272"/>
+            <w:tcMar>
+              <w:top w:w="80" w:type="dxa"/>
+              <w:start w:w="120" w:type="dxa"/>
+              <w:bottom w:w="80" w:type="dxa"/>
+              <w:end w:w="120" w:type="dxa"/>
+            </w:tcMar>
+            <w:vAlign w:val="center"/>
+          </w:tcPr>
+          <w:p>
+            <w:pPr>
+              <w:spacing w:after="0"/>
+            </w:pPr>
+            <w:r>
+              <w:rPr>
+                <w:rFonts w:ascii="Calibri" w:hAnsi="Calibri"/>
+                <w:b w:val="0"/>
+                <w:i w:val="0"/>
+                <w:color w:val="000000"/>
+                <w:sz w:val="18"/>
+              </w:rPr>
+              <w:t>Base field testing recommends at least three identical units co-located with FRM/FEM reference monitors for at least 30 days per site.</w:t>
+            </w:r>
+          </w:p>
+        </w:tc>
+      </w:tr>
+    </w:tbl>
+    <w:p>
+      <w:pPr>
+        <w:spacing w:after="0"/>
+      </w:pPr>
+    </w:p>
+    <w:p>
+      <w:pPr>
+        <w:keepNext w:val="0"/>
+        <w:spacing w:after="80" w:line="264" w:lineRule="auto"/>
+      </w:pPr>
+      <w:r>
+        <w:rPr>
+          <w:rFonts w:ascii="Calibri" w:hAnsi="Calibri"/>
+          <w:b/>
+          <w:i w:val="0"/>
+          <w:color w:val="000000"/>
+          <w:sz w:val="21"/>
+        </w:rPr>
+        <w:t xml:space="preserve">What it shows: </w:t>
+      </w:r>
+      <w:r>
+        <w:rPr>
+          <w:rFonts w:ascii="Calibri" w:hAnsi="Calibri"/>
+          <w:b w:val="0"/>
+          <w:i w:val="0"/>
+          <w:color w:val="000000"/>
+          <w:sz w:val="21"/>
+        </w:rPr>
+        <w:t>A defensible evaluation should report R², slope, intercept, RMSE/NRMSE, and data completeness under a defined co-location protocol.</w:t>
+      </w:r>
+    </w:p>
+    <w:p>
+      <w:pPr>
+        <w:keepNext w:val="0"/>
+        <w:spacing w:after="80" w:line="264" w:lineRule="auto"/>
+      </w:pPr>
+      <w:r>
+        <w:rPr>
+          <w:rFonts w:ascii="Calibri" w:hAnsi="Calibri"/>
+          <w:b/>
+          <w:i w:val="0"/>
+          <w:color w:val="000000"/>
+          <w:sz w:val="21"/>
+        </w:rPr>
+        <w:t xml:space="preserve">Brief conclusion: </w:t>
+      </w:r>
+      <w:r>
+        <w:rPr>
+          <w:rFonts w:ascii="Calibri" w:hAnsi="Calibri"/>
+          <w:b w:val="0"/>
+          <w:i w:val="0"/>
+          <w:color w:val="000000"/>
+          <w:sz w:val="21"/>
+        </w:rPr>
+        <w:t>The protocol supplies a repeatable PM2.5 performance framework, but it does not certify a sensor or justify enclosure design choices.</w:t>
+      </w:r>
+    </w:p>
+    <w:p>
+      <w:pPr>
+        <w:keepNext w:val="0"/>
+        <w:spacing w:after="60" w:line="264" w:lineRule="auto"/>
+      </w:pPr>
+      <w:r>
+        <w:rPr>
+          <w:rFonts w:ascii="Calibri" w:hAnsi="Calibri"/>
+          <w:b/>
+          <w:i w:val="0"/>
+          <w:color w:val="000000"/>
+          <w:sz w:val="21"/>
+        </w:rPr>
+        <w:t xml:space="preserve">Importance to this research: </w:t>
+      </w:r>
+      <w:r>
+        <w:rPr>
+          <w:rFonts w:ascii="Calibri" w:hAnsi="Calibri"/>
+          <w:b w:val="0"/>
+          <w:i w:val="0"/>
+          <w:color w:val="000000"/>
+          <w:sz w:val="21"/>
+        </w:rPr>
+        <w:t>Anchors the proposed 30-day co-location target and the accuracy and completeness metrics for any PM channel.</w:t>
+      </w:r>
+    </w:p>
+    <w:p>
+      <w:pPr>
+        <w:keepNext/>
+        <w:spacing w:after="40" w:line="264" w:lineRule="auto"/>
+      </w:pPr>
+      <w:r>
+        <w:rPr>
+          <w:rFonts w:ascii="Calibri" w:hAnsi="Calibri"/>
+          <w:b/>
+          <w:i w:val="0"/>
+          <w:color w:val="000000"/>
+          <w:sz w:val="21"/>
+        </w:rPr>
+        <w:t>Things to consider moving forward</w:t>
+      </w:r>
+      <w:r>
+        <w:rPr>
+          <w:rFonts w:ascii="Calibri" w:hAnsi="Calibri"/>
+          <w:b w:val="0"/>
+          <w:i w:val="0"/>
+          <w:color w:val="000000"/>
+          <w:sz w:val="21"/>
+        </w:rPr>
+      </w:r>
+    </w:p>
+    <w:p>
+      <w:pPr>
+        <w:pStyle w:val="ListBullet"/>
+        <w:spacing w:after="40" w:line="259" w:lineRule="auto"/>
+      </w:pPr>
+      <w:r>
+        <w:rPr>
+          <w:rFonts w:ascii="Calibri" w:hAnsi="Calibri"/>
+          <w:b w:val="0"/>
+          <w:i w:val="0"/>
+          <w:color w:val="000000"/>
+          <w:sz w:val="20"/>
+        </w:rPr>
+        <w:t>Use the EPA metric set consistently across enclosure variants.</w:t>
+      </w:r>
+    </w:p>
+    <w:p>
+      <w:pPr>
+        <w:pStyle w:val="ListBullet"/>
+        <w:spacing w:after="40" w:line="259" w:lineRule="auto"/>
+      </w:pPr>
+      <w:r>
+        <w:rPr>
+          <w:rFonts w:ascii="Calibri" w:hAnsi="Calibri"/>
+          <w:b w:val="0"/>
+          <w:i w:val="0"/>
+          <w:color w:val="000000"/>
+          <w:sz w:val="20"/>
+        </w:rPr>
+        <w:t>Do not transfer PM2.5 target values to temperature, RH, pressure, or gas channels.</w:t>
+      </w:r>
+    </w:p>
+    <w:p>
+      <w:pPr>
+        <w:pStyle w:val="Heading2"/>
+        <w:keepNext/>
+      </w:pPr>
+      <w:r>
+        <w:t>21. World Meteorological Organization (2023)</w:t>
+      </w:r>
+    </w:p>
+    <w:p>
+      <w:pPr>
+        <w:keepNext/>
+        <w:spacing w:after="60" w:line="264" w:lineRule="auto"/>
+      </w:pPr>
+      <w:r>
+        <w:rPr>
+          <w:rFonts w:ascii="Calibri" w:hAnsi="Calibri"/>
+          <w:b w:val="0"/>
+          <w:i/>
+          <w:color w:val="17324D"/>
+          <w:sz w:val="22"/>
+        </w:rPr>
+        <w:t>Guide to Instruments and Methods of Observation (WMO-No. 8), Volume I: Measurement of Meteorological Variables</w:t>
+      </w:r>
+    </w:p>
+    <w:p>
+      <w:pPr>
+        <w:keepNext/>
+        <w:spacing w:after="120" w:line="264" w:lineRule="auto"/>
+      </w:pPr>
+      <w:r>
+        <w:rPr>
+          <w:rFonts w:ascii="Calibri" w:hAnsi="Calibri"/>
+          <w:b w:val="0"/>
+          <w:i w:val="0"/>
+          <w:color w:val="667085"/>
+          <w:sz w:val="17"/>
+        </w:rPr>
+        <w:t>Source: https://library.wmo.int/records/item/68695-guide-to-instruments-and-methods-of-observation</w:t>
+      </w:r>
+    </w:p>
+    <w:tbl>
+      <w:tblPr>
+        <w:tblStyle w:val="TableGrid"/>
+        <w:tblW w:type="auto" w:w="0"/>
+        <w:jc w:val="center"/>
+        <w:tblLayout w:type="fixed"/>
+        <w:tblLook w:firstColumn="1" w:firstRow="1" w:lastColumn="0" w:lastRow="0" w:noHBand="0" w:noVBand="1" w:val="04A0"/>
+      </w:tblPr>
+      <w:tblGrid>
+        <w:gridCol w:w="4939"/>
+        <w:gridCol w:w="4939"/>
+      </w:tblGrid>
+      <w:tr>
+        <w:tc>
+          <w:tcPr>
+            <w:tcW w:type="dxa" w:w="1944"/>
+            <w:shd w:fill="EAF2F8"/>
+            <w:tcMar>
+              <w:top w:w="80" w:type="dxa"/>
+              <w:start w:w="120" w:type="dxa"/>
+              <w:bottom w:w="80" w:type="dxa"/>
+              <w:end w:w="120" w:type="dxa"/>
+            </w:tcMar>
+            <w:vAlign w:val="center"/>
+          </w:tcPr>
+          <w:p>
+            <w:pPr>
+              <w:spacing w:after="0"/>
+            </w:pPr>
+            <w:r>
+              <w:rPr>
+                <w:rFonts w:ascii="Calibri" w:hAnsi="Calibri"/>
+                <w:b/>
+                <w:i w:val="0"/>
+                <w:color w:val="17324D"/>
+                <w:sz w:val="18"/>
+              </w:rPr>
+              <w:t>Sensors</w:t>
+            </w:r>
+          </w:p>
+        </w:tc>
+        <w:tc>
+          <w:tcPr>
+            <w:tcW w:type="dxa" w:w="7272"/>
+            <w:tcMar>
+              <w:top w:w="80" w:type="dxa"/>
+              <w:start w:w="120" w:type="dxa"/>
+              <w:bottom w:w="80" w:type="dxa"/>
+              <w:end w:w="120" w:type="dxa"/>
+            </w:tcMar>
+            <w:vAlign w:val="center"/>
+          </w:tcPr>
+          <w:p>
+            <w:pPr>
+              <w:spacing w:after="0"/>
+            </w:pPr>
+            <w:r>
+              <w:rPr>
+                <w:rFonts w:ascii="Calibri" w:hAnsi="Calibri"/>
+                <w:b w:val="0"/>
+                <w:i w:val="0"/>
+                <w:color w:val="000000"/>
+                <w:sz w:val="18"/>
+              </w:rPr>
+              <w:t>No specific models; covers measurement practice for temperature, humidity, pressure, wind, radiation, and precipitation instruments.</w:t>
+            </w:r>
+          </w:p>
+        </w:tc>
+      </w:tr>
+      <w:tr>
+        <w:tc>
+          <w:tcPr>
+            <w:tcW w:type="dxa" w:w="1944"/>
+            <w:shd w:fill="EAF2F8"/>
+            <w:tcMar>
+              <w:top w:w="80" w:type="dxa"/>
+              <w:start w:w="120" w:type="dxa"/>
+              <w:bottom w:w="80" w:type="dxa"/>
+              <w:end w:w="120" w:type="dxa"/>
+            </w:tcMar>
+            <w:vAlign w:val="center"/>
+          </w:tcPr>
+          <w:p>
+            <w:pPr>
+              <w:spacing w:after="0"/>
+            </w:pPr>
+            <w:r>
+              <w:rPr>
+                <w:rFonts w:ascii="Calibri" w:hAnsi="Calibri"/>
+                <w:b/>
+                <w:i w:val="0"/>
+                <w:color w:val="17324D"/>
+                <w:sz w:val="18"/>
+              </w:rPr>
+              <w:t>Materials</w:t>
+            </w:r>
+          </w:p>
+        </w:tc>
+        <w:tc>
+          <w:tcPr>
+            <w:tcW w:type="dxa" w:w="7272"/>
+            <w:tcMar>
+              <w:top w:w="80" w:type="dxa"/>
+              <w:start w:w="120" w:type="dxa"/>
+              <w:bottom w:w="80" w:type="dxa"/>
+              <w:end w:w="120" w:type="dxa"/>
+            </w:tcMar>
+            <w:vAlign w:val="center"/>
+          </w:tcPr>
+          <w:p>
+            <w:pPr>
+              <w:spacing w:after="0"/>
+            </w:pPr>
+            <w:r>
+              <w:rPr>
+                <w:rFonts w:ascii="Calibri" w:hAnsi="Calibri"/>
+                <w:b w:val="0"/>
+                <w:i w:val="0"/>
+                <w:color w:val="000000"/>
+                <w:sz w:val="18"/>
+              </w:rPr>
+              <w:t>Discusses radiation screens and shields as measurement practice; does not compare printed enclosure materials.</w:t>
+            </w:r>
+          </w:p>
+        </w:tc>
+      </w:tr>
+      <w:tr>
+        <w:tc>
+          <w:tcPr>
+            <w:tcW w:type="dxa" w:w="1944"/>
+            <w:shd w:fill="EAF2F8"/>
+            <w:tcMar>
+              <w:top w:w="80" w:type="dxa"/>
+              <w:start w:w="120" w:type="dxa"/>
+              <w:bottom w:w="80" w:type="dxa"/>
+              <w:end w:w="120" w:type="dxa"/>
+            </w:tcMar>
+            <w:vAlign w:val="center"/>
+          </w:tcPr>
+          <w:p>
+            <w:pPr>
+              <w:spacing w:after="0"/>
+            </w:pPr>
+            <w:r>
+              <w:rPr>
+                <w:rFonts w:ascii="Calibri" w:hAnsi="Calibri"/>
+                <w:b/>
+                <w:i w:val="0"/>
+                <w:color w:val="17324D"/>
+                <w:sz w:val="18"/>
+              </w:rPr>
+              <w:t>Geometry</w:t>
+            </w:r>
+          </w:p>
+        </w:tc>
+        <w:tc>
+          <w:tcPr>
+            <w:tcW w:type="dxa" w:w="7272"/>
+            <w:tcMar>
+              <w:top w:w="80" w:type="dxa"/>
+              <w:start w:w="120" w:type="dxa"/>
+              <w:bottom w:w="80" w:type="dxa"/>
+              <w:end w:w="120" w:type="dxa"/>
+            </w:tcMar>
+            <w:vAlign w:val="center"/>
+          </w:tcPr>
+          <w:p>
+            <w:pPr>
+              <w:spacing w:after="0"/>
+            </w:pPr>
+            <w:r>
+              <w:rPr>
+                <w:rFonts w:ascii="Calibri" w:hAnsi="Calibri"/>
+                <w:b w:val="0"/>
+                <w:i w:val="0"/>
+                <w:color w:val="000000"/>
+                <w:sz w:val="18"/>
+              </w:rPr>
+              <w:t>Defines exposure and siting considerations such as shielding, mounting height, and distance from surfaces and obstructions.</w:t>
+            </w:r>
+          </w:p>
+        </w:tc>
+      </w:tr>
+      <w:tr>
+        <w:tc>
+          <w:tcPr>
+            <w:tcW w:type="dxa" w:w="1944"/>
+            <w:shd w:fill="EAF2F8"/>
+            <w:tcMar>
+              <w:top w:w="80" w:type="dxa"/>
+              <w:start w:w="120" w:type="dxa"/>
+              <w:bottom w:w="80" w:type="dxa"/>
+              <w:end w:w="120" w:type="dxa"/>
+            </w:tcMar>
+            <w:vAlign w:val="center"/>
+          </w:tcPr>
+          <w:p>
+            <w:pPr>
+              <w:spacing w:after="0"/>
+            </w:pPr>
+            <w:r>
+              <w:rPr>
+                <w:rFonts w:ascii="Calibri" w:hAnsi="Calibri"/>
+                <w:b/>
+                <w:i w:val="0"/>
+                <w:color w:val="17324D"/>
+                <w:sz w:val="18"/>
+              </w:rPr>
+              <w:t>Experimental setup</w:t>
+            </w:r>
+          </w:p>
+        </w:tc>
+        <w:tc>
+          <w:tcPr>
+            <w:tcW w:type="dxa" w:w="7272"/>
+            <w:tcMar>
+              <w:top w:w="80" w:type="dxa"/>
+              <w:start w:w="120" w:type="dxa"/>
+              <w:bottom w:w="80" w:type="dxa"/>
+              <w:end w:w="120" w:type="dxa"/>
+            </w:tcMar>
+            <w:vAlign w:val="center"/>
+          </w:tcPr>
+          <w:p>
+            <w:pPr>
+              <w:spacing w:after="0"/>
+            </w:pPr>
+            <w:r>
+              <w:rPr>
+                <w:rFonts w:ascii="Calibri" w:hAnsi="Calibri"/>
+                <w:b w:val="0"/>
+                <w:i w:val="0"/>
+                <w:color w:val="000000"/>
+                <w:sz w:val="18"/>
+              </w:rPr>
+              <w:t>Operational meteorological guidance for instrument exposure, reference practice, and measurement uncertainty.</w:t>
+            </w:r>
+          </w:p>
+        </w:tc>
+      </w:tr>
+    </w:tbl>
+    <w:p>
+      <w:pPr>
+        <w:spacing w:after="0"/>
+      </w:pPr>
+    </w:p>
+    <w:p>
+      <w:pPr>
+        <w:keepNext w:val="0"/>
+        <w:spacing w:after="80" w:line="264" w:lineRule="auto"/>
+      </w:pPr>
+      <w:r>
+        <w:rPr>
+          <w:rFonts w:ascii="Calibri" w:hAnsi="Calibri"/>
+          <w:b/>
+          <w:i w:val="0"/>
+          <w:color w:val="000000"/>
+          <w:sz w:val="21"/>
+        </w:rPr>
+        <w:t xml:space="preserve">What it shows: </w:t>
+      </w:r>
+      <w:r>
+        <w:rPr>
+          <w:rFonts w:ascii="Calibri" w:hAnsi="Calibri"/>
+          <w:b w:val="0"/>
+          <w:i w:val="0"/>
+          <w:color w:val="000000"/>
+          <w:sz w:val="21"/>
+        </w:rPr>
+        <w:t>Reference quality depends on documented siting, shielding, exposure, and uncertainty—not only sensor specification.</w:t>
+      </w:r>
+    </w:p>
+    <w:p>
+      <w:pPr>
+        <w:keepNext w:val="0"/>
+        <w:spacing w:after="80" w:line="264" w:lineRule="auto"/>
+      </w:pPr>
+      <w:r>
+        <w:rPr>
+          <w:rFonts w:ascii="Calibri" w:hAnsi="Calibri"/>
+          <w:b/>
+          <w:i w:val="0"/>
+          <w:color w:val="000000"/>
+          <w:sz w:val="21"/>
+        </w:rPr>
+        <w:t xml:space="preserve">Brief conclusion: </w:t>
+      </w:r>
+      <w:r>
+        <w:rPr>
+          <w:rFonts w:ascii="Calibri" w:hAnsi="Calibri"/>
+          <w:b w:val="0"/>
+          <w:i w:val="0"/>
+          <w:color w:val="000000"/>
+          <w:sz w:val="21"/>
+        </w:rPr>
+        <w:t>WMO practice defines the measurement target and reference context, but not a specific low-cost enclosure solution.</w:t>
+      </w:r>
+    </w:p>
+    <w:p>
+      <w:pPr>
+        <w:keepNext w:val="0"/>
+        <w:spacing w:after="60" w:line="264" w:lineRule="auto"/>
+      </w:pPr>
+      <w:r>
+        <w:rPr>
+          <w:rFonts w:ascii="Calibri" w:hAnsi="Calibri"/>
+          <w:b/>
+          <w:i w:val="0"/>
+          <w:color w:val="000000"/>
+          <w:sz w:val="21"/>
+        </w:rPr>
+        <w:t xml:space="preserve">Importance to this research: </w:t>
+      </w:r>
+      <w:r>
+        <w:rPr>
+          <w:rFonts w:ascii="Calibri" w:hAnsi="Calibri"/>
+          <w:b w:val="0"/>
+          <w:i w:val="0"/>
+          <w:color w:val="000000"/>
+          <w:sz w:val="21"/>
+        </w:rPr>
+        <w:t>Anchors the deployment-siting rules and the requirement to document reference-instrument uncertainty.</w:t>
+      </w:r>
+    </w:p>
+    <w:p>
+      <w:pPr>
+        <w:keepNext/>
+        <w:spacing w:after="40" w:line="264" w:lineRule="auto"/>
+      </w:pPr>
+      <w:r>
+        <w:rPr>
+          <w:rFonts w:ascii="Calibri" w:hAnsi="Calibri"/>
+          <w:b/>
+          <w:i w:val="0"/>
+          <w:color w:val="000000"/>
+          <w:sz w:val="21"/>
+        </w:rPr>
+        <w:t>Things to consider moving forward</w:t>
+      </w:r>
+      <w:r>
+        <w:rPr>
+          <w:rFonts w:ascii="Calibri" w:hAnsi="Calibri"/>
+          <w:b w:val="0"/>
+          <w:i w:val="0"/>
+          <w:color w:val="000000"/>
+          <w:sz w:val="21"/>
+        </w:rPr>
+      </w:r>
+    </w:p>
+    <w:p>
+      <w:pPr>
+        <w:pStyle w:val="ListBullet"/>
+        <w:spacing w:after="40" w:line="259" w:lineRule="auto"/>
+      </w:pPr>
+      <w:r>
+        <w:rPr>
+          <w:rFonts w:ascii="Calibri" w:hAnsi="Calibri"/>
+          <w:b w:val="0"/>
+          <w:i w:val="0"/>
+          <w:color w:val="000000"/>
+          <w:sz w:val="20"/>
+        </w:rPr>
+        <w:t>State which WMO exposure practices the deployment follows and document any unavoidable departures.</w:t>
+      </w:r>
+    </w:p>
+    <w:p>
+      <w:pPr>
+        <w:pStyle w:val="ListBullet"/>
+        <w:spacing w:after="40" w:line="259" w:lineRule="auto"/>
+      </w:pPr>
+      <w:r>
+        <w:rPr>
+          <w:rFonts w:ascii="Calibri" w:hAnsi="Calibri"/>
+          <w:b w:val="0"/>
+          <w:i w:val="0"/>
+          <w:color w:val="000000"/>
+          <w:sz w:val="20"/>
+        </w:rPr>
+        <w:t>Use the shield literature, not WMO-No. 8 alone, to select low-cost materials and geometry.</w:t>
+      </w:r>
+    </w:p>
+    <w:p>
+      <w:pPr>
+        <w:pStyle w:val="Heading2"/>
+        <w:keepNext/>
+      </w:pPr>
+      <w:r>
+        <w:t>22. ASTM International (2022)</w:t>
+      </w:r>
+    </w:p>
+    <w:p>
+      <w:pPr>
+        <w:keepNext/>
+        <w:spacing w:after="60" w:line="264" w:lineRule="auto"/>
+      </w:pPr>
+      <w:r>
+        <w:rPr>
+          <w:rFonts w:ascii="Calibri" w:hAnsi="Calibri"/>
+          <w:b w:val="0"/>
+          <w:i/>
+          <w:color w:val="17324D"/>
+          <w:sz w:val="22"/>
+        </w:rPr>
+        <w:t>ASTM D8406-22: Standard Practice for Performance Evaluation of Ambient Outdoor Air Quality Sensors and Sensor-Based Instruments for Portable and Fixed-Point Measurement</w:t>
+      </w:r>
+    </w:p>
+    <w:p>
+      <w:pPr>
+        <w:keepNext/>
+        <w:spacing w:after="120" w:line="264" w:lineRule="auto"/>
+      </w:pPr>
+      <w:r>
+        <w:rPr>
+          <w:rFonts w:ascii="Calibri" w:hAnsi="Calibri"/>
+          <w:b w:val="0"/>
+          <w:i w:val="0"/>
+          <w:color w:val="667085"/>
+          <w:sz w:val="17"/>
+        </w:rPr>
+        <w:t>Source: https://store.astm.org/d8406-22.html</w:t>
+      </w:r>
+    </w:p>
+    <w:tbl>
+      <w:tblPr>
+        <w:tblStyle w:val="TableGrid"/>
+        <w:tblW w:type="auto" w:w="0"/>
+        <w:jc w:val="center"/>
+        <w:tblLayout w:type="fixed"/>
+        <w:tblLook w:firstColumn="1" w:firstRow="1" w:lastColumn="0" w:lastRow="0" w:noHBand="0" w:noVBand="1" w:val="04A0"/>
+      </w:tblPr>
+      <w:tblGrid>
+        <w:gridCol w:w="4939"/>
+        <w:gridCol w:w="4939"/>
+      </w:tblGrid>
+      <w:tr>
+        <w:tc>
+          <w:tcPr>
+            <w:tcW w:type="dxa" w:w="1944"/>
+            <w:shd w:fill="EAF2F8"/>
+            <w:tcMar>
+              <w:top w:w="80" w:type="dxa"/>
+              <w:start w:w="120" w:type="dxa"/>
+              <w:bottom w:w="80" w:type="dxa"/>
+              <w:end w:w="120" w:type="dxa"/>
+            </w:tcMar>
+            <w:vAlign w:val="center"/>
+          </w:tcPr>
+          <w:p>
+            <w:pPr>
+              <w:spacing w:after="0"/>
+            </w:pPr>
+            <w:r>
+              <w:rPr>
+                <w:rFonts w:ascii="Calibri" w:hAnsi="Calibri"/>
+                <w:b/>
+                <w:i w:val="0"/>
+                <w:color w:val="17324D"/>
+                <w:sz w:val="18"/>
+              </w:rPr>
+              <w:t>Sensors</w:t>
+            </w:r>
+          </w:p>
+        </w:tc>
+        <w:tc>
+          <w:tcPr>
+            <w:tcW w:type="dxa" w:w="7272"/>
+            <w:tcMar>
+              <w:top w:w="80" w:type="dxa"/>
+              <w:start w:w="120" w:type="dxa"/>
+              <w:bottom w:w="80" w:type="dxa"/>
+              <w:end w:w="120" w:type="dxa"/>
+            </w:tcMar>
+            <w:vAlign w:val="center"/>
+          </w:tcPr>
+          <w:p>
+            <w:pPr>
+              <w:spacing w:after="0"/>
+            </w:pPr>
+            <w:r>
+              <w:rPr>
+                <w:rFonts w:ascii="Calibri" w:hAnsi="Calibri"/>
+                <w:b w:val="0"/>
+                <w:i w:val="0"/>
+                <w:color w:val="000000"/>
+                <w:sz w:val="18"/>
+              </w:rPr>
+              <w:t>No specific models; applies to outdoor sensor instruments for O3, CO, NO2, SO2, PM10, and PM2.5.</w:t>
+            </w:r>
+          </w:p>
+        </w:tc>
+      </w:tr>
+      <w:tr>
+        <w:tc>
+          <w:tcPr>
+            <w:tcW w:type="dxa" w:w="1944"/>
+            <w:shd w:fill="EAF2F8"/>
+            <w:tcMar>
+              <w:top w:w="80" w:type="dxa"/>
+              <w:start w:w="120" w:type="dxa"/>
+              <w:bottom w:w="80" w:type="dxa"/>
+              <w:end w:w="120" w:type="dxa"/>
+            </w:tcMar>
+            <w:vAlign w:val="center"/>
+          </w:tcPr>
+          <w:p>
+            <w:pPr>
+              <w:spacing w:after="0"/>
+            </w:pPr>
+            <w:r>
+              <w:rPr>
+                <w:rFonts w:ascii="Calibri" w:hAnsi="Calibri"/>
+                <w:b/>
+                <w:i w:val="0"/>
+                <w:color w:val="17324D"/>
+                <w:sz w:val="18"/>
+              </w:rPr>
+              <w:t>Materials</w:t>
+            </w:r>
+          </w:p>
+        </w:tc>
+        <w:tc>
+          <w:tcPr>
+            <w:tcW w:type="dxa" w:w="7272"/>
+            <w:tcMar>
+              <w:top w:w="80" w:type="dxa"/>
+              <w:start w:w="120" w:type="dxa"/>
+              <w:bottom w:w="80" w:type="dxa"/>
+              <w:end w:w="120" w:type="dxa"/>
+            </w:tcMar>
+            <w:vAlign w:val="center"/>
+          </w:tcPr>
+          <w:p>
+            <w:pPr>
+              <w:spacing w:after="0"/>
+            </w:pPr>
+            <w:r>
+              <w:rPr>
+                <w:rFonts w:ascii="Calibri" w:hAnsi="Calibri"/>
+                <w:b w:val="0"/>
+                <w:i w:val="0"/>
+                <w:color w:val="000000"/>
+                <w:sz w:val="18"/>
+              </w:rPr>
+              <w:t>Not addressed; the practice evaluates instrument performance rather than enclosure materials.</w:t>
+            </w:r>
+          </w:p>
+        </w:tc>
+      </w:tr>
+      <w:tr>
+        <w:tc>
+          <w:tcPr>
+            <w:tcW w:type="dxa" w:w="1944"/>
+            <w:shd w:fill="EAF2F8"/>
+            <w:tcMar>
+              <w:top w:w="80" w:type="dxa"/>
+              <w:start w:w="120" w:type="dxa"/>
+              <w:bottom w:w="80" w:type="dxa"/>
+              <w:end w:w="120" w:type="dxa"/>
+            </w:tcMar>
+            <w:vAlign w:val="center"/>
+          </w:tcPr>
+          <w:p>
+            <w:pPr>
+              <w:spacing w:after="0"/>
+            </w:pPr>
+            <w:r>
+              <w:rPr>
+                <w:rFonts w:ascii="Calibri" w:hAnsi="Calibri"/>
+                <w:b/>
+                <w:i w:val="0"/>
+                <w:color w:val="17324D"/>
+                <w:sz w:val="18"/>
+              </w:rPr>
+              <w:t>Geometry</w:t>
+            </w:r>
+          </w:p>
+        </w:tc>
+        <w:tc>
+          <w:tcPr>
+            <w:tcW w:type="dxa" w:w="7272"/>
+            <w:tcMar>
+              <w:top w:w="80" w:type="dxa"/>
+              <w:start w:w="120" w:type="dxa"/>
+              <w:bottom w:w="80" w:type="dxa"/>
+              <w:end w:w="120" w:type="dxa"/>
+            </w:tcMar>
+            <w:vAlign w:val="center"/>
+          </w:tcPr>
+          <w:p>
+            <w:pPr>
+              <w:spacing w:after="0"/>
+            </w:pPr>
+            <w:r>
+              <w:rPr>
+                <w:rFonts w:ascii="Calibri" w:hAnsi="Calibri"/>
+                <w:b w:val="0"/>
+                <w:i w:val="0"/>
+                <w:color w:val="000000"/>
+                <w:sz w:val="18"/>
+              </w:rPr>
+              <w:t>Not addressed; portable and fixed-point instruments are evaluated as complete systems.</w:t>
+            </w:r>
+          </w:p>
+        </w:tc>
+      </w:tr>
+      <w:tr>
+        <w:tc>
+          <w:tcPr>
+            <w:tcW w:type="dxa" w:w="1944"/>
+            <w:shd w:fill="EAF2F8"/>
+            <w:tcMar>
+              <w:top w:w="80" w:type="dxa"/>
+              <w:start w:w="120" w:type="dxa"/>
+              <w:bottom w:w="80" w:type="dxa"/>
+              <w:end w:w="120" w:type="dxa"/>
+            </w:tcMar>
+            <w:vAlign w:val="center"/>
+          </w:tcPr>
+          <w:p>
+            <w:pPr>
+              <w:spacing w:after="0"/>
+            </w:pPr>
+            <w:r>
+              <w:rPr>
+                <w:rFonts w:ascii="Calibri" w:hAnsi="Calibri"/>
+                <w:b/>
+                <w:i w:val="0"/>
+                <w:color w:val="17324D"/>
+                <w:sz w:val="18"/>
+              </w:rPr>
+              <w:t>Experimental setup</w:t>
+            </w:r>
+          </w:p>
+        </w:tc>
+        <w:tc>
+          <w:tcPr>
+            <w:tcW w:type="dxa" w:w="7272"/>
+            <w:tcMar>
+              <w:top w:w="80" w:type="dxa"/>
+              <w:start w:w="120" w:type="dxa"/>
+              <w:bottom w:w="80" w:type="dxa"/>
+              <w:end w:w="120" w:type="dxa"/>
+            </w:tcMar>
+            <w:vAlign w:val="center"/>
+          </w:tcPr>
+          <w:p>
+            <w:pPr>
+              <w:spacing w:after="0"/>
+            </w:pPr>
+            <w:r>
+              <w:rPr>
+                <w:rFonts w:ascii="Calibri" w:hAnsi="Calibri"/>
+                <w:b w:val="0"/>
+                <w:i w:val="0"/>
+                <w:color w:val="000000"/>
+                <w:sz w:val="18"/>
+              </w:rPr>
+              <w:t>Standardized field performance evaluation for ambient outdoor air-quality sensor instruments; characterization here is limited to the published scope.</w:t>
+            </w:r>
+          </w:p>
+        </w:tc>
+      </w:tr>
+    </w:tbl>
+    <w:p>
+      <w:pPr>
+        <w:spacing w:after="0"/>
+      </w:pPr>
+    </w:p>
+    <w:p>
+      <w:pPr>
+        <w:keepNext w:val="0"/>
+        <w:spacing w:after="80" w:line="264" w:lineRule="auto"/>
+      </w:pPr>
+      <w:r>
+        <w:rPr>
+          <w:rFonts w:ascii="Calibri" w:hAnsi="Calibri"/>
+          <w:b/>
+          <w:i w:val="0"/>
+          <w:color w:val="000000"/>
+          <w:sz w:val="21"/>
+        </w:rPr>
+        <w:t xml:space="preserve">What it shows: </w:t>
+      </w:r>
+      <w:r>
+        <w:rPr>
+          <w:rFonts w:ascii="Calibri" w:hAnsi="Calibri"/>
+          <w:b w:val="0"/>
+          <w:i w:val="0"/>
+          <w:color w:val="000000"/>
+          <w:sz w:val="21"/>
+        </w:rPr>
+        <w:t>A consensus standard exists for the same broad fixed-point outdoor instrument class as the proposed box.</w:t>
+      </w:r>
+    </w:p>
+    <w:p>
+      <w:pPr>
+        <w:keepNext w:val="0"/>
+        <w:spacing w:after="80" w:line="264" w:lineRule="auto"/>
+      </w:pPr>
+      <w:r>
+        <w:rPr>
+          <w:rFonts w:ascii="Calibri" w:hAnsi="Calibri"/>
+          <w:b/>
+          <w:i w:val="0"/>
+          <w:color w:val="000000"/>
+          <w:sz w:val="21"/>
+        </w:rPr>
+        <w:t xml:space="preserve">Brief conclusion: </w:t>
+      </w:r>
+      <w:r>
+        <w:rPr>
+          <w:rFonts w:ascii="Calibri" w:hAnsi="Calibri"/>
+          <w:b w:val="0"/>
+          <w:i w:val="0"/>
+          <w:color w:val="000000"/>
+          <w:sz w:val="21"/>
+        </w:rPr>
+        <w:t>ASTM D8406-22 strengthens the methods basis for gas and PM evaluation but cannot support enclosure claims from its public scope alone.</w:t>
+      </w:r>
+    </w:p>
+    <w:p>
+      <w:pPr>
+        <w:keepNext w:val="0"/>
+        <w:spacing w:after="60" w:line="264" w:lineRule="auto"/>
+      </w:pPr>
+      <w:r>
+        <w:rPr>
+          <w:rFonts w:ascii="Calibri" w:hAnsi="Calibri"/>
+          <w:b/>
+          <w:i w:val="0"/>
+          <w:color w:val="000000"/>
+          <w:sz w:val="21"/>
+        </w:rPr>
+        <w:t xml:space="preserve">Importance to this research: </w:t>
+      </w:r>
+      <w:r>
+        <w:rPr>
+          <w:rFonts w:ascii="Calibri" w:hAnsi="Calibri"/>
+          <w:b w:val="0"/>
+          <w:i w:val="0"/>
+          <w:color w:val="000000"/>
+          <w:sz w:val="21"/>
+        </w:rPr>
+        <w:t>Provides a citable consensus-standard counterpart to the EPA protocol for gas and particulate channels.</w:t>
+      </w:r>
+    </w:p>
+    <w:p>
+      <w:pPr>
+        <w:keepNext/>
+        <w:spacing w:after="40" w:line="264" w:lineRule="auto"/>
+      </w:pPr>
+      <w:r>
+        <w:rPr>
+          <w:rFonts w:ascii="Calibri" w:hAnsi="Calibri"/>
+          <w:b/>
+          <w:i w:val="0"/>
+          <w:color w:val="000000"/>
+          <w:sz w:val="21"/>
+        </w:rPr>
+        <w:t>Things to consider moving forward</w:t>
+      </w:r>
+      <w:r>
+        <w:rPr>
+          <w:rFonts w:ascii="Calibri" w:hAnsi="Calibri"/>
+          <w:b w:val="0"/>
+          <w:i w:val="0"/>
+          <w:color w:val="000000"/>
+          <w:sz w:val="21"/>
+        </w:rPr>
+      </w:r>
+    </w:p>
+    <w:p>
+      <w:pPr>
+        <w:pStyle w:val="ListBullet"/>
+        <w:spacing w:after="40" w:line="259" w:lineRule="auto"/>
+      </w:pPr>
+      <w:r>
+        <w:rPr>
+          <w:rFonts w:ascii="Calibri" w:hAnsi="Calibri"/>
+          <w:b w:val="0"/>
+          <w:i w:val="0"/>
+          <w:color w:val="000000"/>
+          <w:sz w:val="20"/>
+        </w:rPr>
+        <w:t>Keep claims at scope level until the paywalled full standard is obtained and reviewed.</w:t>
+      </w:r>
+    </w:p>
+    <w:p>
+      <w:pPr>
+        <w:pStyle w:val="ListBullet"/>
+        <w:spacing w:after="40" w:line="259" w:lineRule="auto"/>
+      </w:pPr>
+      <w:r>
+        <w:rPr>
+          <w:rFonts w:ascii="Calibri" w:hAnsi="Calibri"/>
+          <w:b w:val="0"/>
+          <w:i w:val="0"/>
+          <w:color w:val="000000"/>
+          <w:sz w:val="20"/>
+        </w:rPr>
+        <w:t>Use separate meteorological guidance and shield evidence for T/RH siting and enclosure design.</w:t>
+      </w:r>
+    </w:p>
+    <w:p>
+      <w:pPr>
+        <w:pStyle w:val="Heading2"/>
+        <w:keepNext/>
+      </w:pPr>
+      <w:r>
+        <w:t>23. European Committee for Standardization (2021)</w:t>
+      </w:r>
+    </w:p>
+    <w:p>
+      <w:pPr>
+        <w:keepNext/>
+        <w:spacing w:after="60" w:line="264" w:lineRule="auto"/>
+      </w:pPr>
+      <w:r>
+        <w:rPr>
+          <w:rFonts w:ascii="Calibri" w:hAnsi="Calibri"/>
+          <w:b w:val="0"/>
+          <w:i/>
+          <w:color w:val="17324D"/>
+          <w:sz w:val="22"/>
+        </w:rPr>
+        <w:t>CEN/TS 17660-1:2021: Air Quality—Performance Evaluation of Air Quality Sensor Systems—Part 1: Gaseous Pollutants in Ambient Air</w:t>
+      </w:r>
+    </w:p>
+    <w:p>
+      <w:pPr>
+        <w:keepNext/>
+        <w:spacing w:after="120" w:line="264" w:lineRule="auto"/>
+      </w:pPr>
+      <w:r>
+        <w:rPr>
+          <w:rFonts w:ascii="Calibri" w:hAnsi="Calibri"/>
+          <w:b w:val="0"/>
+          <w:i w:val="0"/>
+          <w:color w:val="667085"/>
+          <w:sz w:val="17"/>
+        </w:rPr>
+        <w:t>Source: https://standards.cencenelec.eu/dyn/www/f?p=205:110:0::::FSP_PROJECT:65599</w:t>
+      </w:r>
+    </w:p>
+    <w:tbl>
+      <w:tblPr>
+        <w:tblStyle w:val="TableGrid"/>
+        <w:tblW w:type="auto" w:w="0"/>
+        <w:jc w:val="center"/>
+        <w:tblLayout w:type="fixed"/>
+        <w:tblLook w:firstColumn="1" w:firstRow="1" w:lastColumn="0" w:lastRow="0" w:noHBand="0" w:noVBand="1" w:val="04A0"/>
+      </w:tblPr>
+      <w:tblGrid>
+        <w:gridCol w:w="4939"/>
+        <w:gridCol w:w="4939"/>
+      </w:tblGrid>
+      <w:tr>
+        <w:tc>
+          <w:tcPr>
+            <w:tcW w:type="dxa" w:w="1944"/>
+            <w:shd w:fill="EAF2F8"/>
+            <w:tcMar>
+              <w:top w:w="80" w:type="dxa"/>
+              <w:start w:w="120" w:type="dxa"/>
+              <w:bottom w:w="80" w:type="dxa"/>
+              <w:end w:w="120" w:type="dxa"/>
+            </w:tcMar>
+            <w:vAlign w:val="center"/>
+          </w:tcPr>
+          <w:p>
+            <w:pPr>
+              <w:spacing w:after="0"/>
+            </w:pPr>
+            <w:r>
+              <w:rPr>
+                <w:rFonts w:ascii="Calibri" w:hAnsi="Calibri"/>
+                <w:b/>
+                <w:i w:val="0"/>
+                <w:color w:val="17324D"/>
+                <w:sz w:val="18"/>
+              </w:rPr>
+              <w:t>Sensors</w:t>
+            </w:r>
+          </w:p>
+        </w:tc>
+        <w:tc>
+          <w:tcPr>
+            <w:tcW w:type="dxa" w:w="7272"/>
+            <w:tcMar>
+              <w:top w:w="80" w:type="dxa"/>
+              <w:start w:w="120" w:type="dxa"/>
+              <w:bottom w:w="80" w:type="dxa"/>
+              <w:end w:w="120" w:type="dxa"/>
+            </w:tcMar>
+            <w:vAlign w:val="center"/>
+          </w:tcPr>
+          <w:p>
+            <w:pPr>
+              <w:spacing w:after="0"/>
+            </w:pPr>
+            <w:r>
+              <w:rPr>
+                <w:rFonts w:ascii="Calibri" w:hAnsi="Calibri"/>
+                <w:b w:val="0"/>
+                <w:i w:val="0"/>
+                <w:color w:val="000000"/>
+                <w:sz w:val="18"/>
+              </w:rPr>
+              <w:t>No specific models; applies to systems for O3, NO/NO2/NOx, CO, SO2, and benzene in ambient air.</w:t>
+            </w:r>
+          </w:p>
+        </w:tc>
+      </w:tr>
+      <w:tr>
+        <w:tc>
+          <w:tcPr>
+            <w:tcW w:type="dxa" w:w="1944"/>
+            <w:shd w:fill="EAF2F8"/>
+            <w:tcMar>
+              <w:top w:w="80" w:type="dxa"/>
+              <w:start w:w="120" w:type="dxa"/>
+              <w:bottom w:w="80" w:type="dxa"/>
+              <w:end w:w="120" w:type="dxa"/>
+            </w:tcMar>
+            <w:vAlign w:val="center"/>
+          </w:tcPr>
+          <w:p>
+            <w:pPr>
+              <w:spacing w:after="0"/>
+            </w:pPr>
+            <w:r>
+              <w:rPr>
+                <w:rFonts w:ascii="Calibri" w:hAnsi="Calibri"/>
+                <w:b/>
+                <w:i w:val="0"/>
+                <w:color w:val="17324D"/>
+                <w:sz w:val="18"/>
+              </w:rPr>
+              <w:t>Materials</w:t>
+            </w:r>
+          </w:p>
+        </w:tc>
+        <w:tc>
+          <w:tcPr>
+            <w:tcW w:type="dxa" w:w="7272"/>
+            <w:tcMar>
+              <w:top w:w="80" w:type="dxa"/>
+              <w:start w:w="120" w:type="dxa"/>
+              <w:bottom w:w="80" w:type="dxa"/>
+              <w:end w:w="120" w:type="dxa"/>
+            </w:tcMar>
+            <w:vAlign w:val="center"/>
+          </w:tcPr>
+          <w:p>
+            <w:pPr>
+              <w:spacing w:after="0"/>
+            </w:pPr>
+            <w:r>
+              <w:rPr>
+                <w:rFonts w:ascii="Calibri" w:hAnsi="Calibri"/>
+                <w:b w:val="0"/>
+                <w:i w:val="0"/>
+                <w:color w:val="000000"/>
+                <w:sz w:val="18"/>
+              </w:rPr>
+              <w:t>Not addressed; the specification classifies system performance, not enclosure materials.</w:t>
+            </w:r>
+          </w:p>
+        </w:tc>
+      </w:tr>
+      <w:tr>
+        <w:tc>
+          <w:tcPr>
+            <w:tcW w:type="dxa" w:w="1944"/>
+            <w:shd w:fill="EAF2F8"/>
+            <w:tcMar>
+              <w:top w:w="80" w:type="dxa"/>
+              <w:start w:w="120" w:type="dxa"/>
+              <w:bottom w:w="80" w:type="dxa"/>
+              <w:end w:w="120" w:type="dxa"/>
+            </w:tcMar>
+            <w:vAlign w:val="center"/>
+          </w:tcPr>
+          <w:p>
+            <w:pPr>
+              <w:spacing w:after="0"/>
+            </w:pPr>
+            <w:r>
+              <w:rPr>
+                <w:rFonts w:ascii="Calibri" w:hAnsi="Calibri"/>
+                <w:b/>
+                <w:i w:val="0"/>
+                <w:color w:val="17324D"/>
+                <w:sz w:val="18"/>
+              </w:rPr>
+              <w:t>Geometry</w:t>
+            </w:r>
+          </w:p>
+        </w:tc>
+        <w:tc>
+          <w:tcPr>
+            <w:tcW w:type="dxa" w:w="7272"/>
+            <w:tcMar>
+              <w:top w:w="80" w:type="dxa"/>
+              <w:start w:w="120" w:type="dxa"/>
+              <w:bottom w:w="80" w:type="dxa"/>
+              <w:end w:w="120" w:type="dxa"/>
+            </w:tcMar>
+            <w:vAlign w:val="center"/>
+          </w:tcPr>
+          <w:p>
+            <w:pPr>
+              <w:spacing w:after="0"/>
+            </w:pPr>
+            <w:r>
+              <w:rPr>
+                <w:rFonts w:ascii="Calibri" w:hAnsi="Calibri"/>
+                <w:b w:val="0"/>
+                <w:i w:val="0"/>
+                <w:color w:val="000000"/>
+                <w:sz w:val="18"/>
+              </w:rPr>
+              <w:t>Not addressed; enclosure and airflow design are outside the published scope.</w:t>
+            </w:r>
+          </w:p>
+        </w:tc>
+      </w:tr>
+      <w:tr>
+        <w:tc>
+          <w:tcPr>
+            <w:tcW w:type="dxa" w:w="1944"/>
+            <w:shd w:fill="EAF2F8"/>
+            <w:tcMar>
+              <w:top w:w="80" w:type="dxa"/>
+              <w:start w:w="120" w:type="dxa"/>
+              <w:bottom w:w="80" w:type="dxa"/>
+              <w:end w:w="120" w:type="dxa"/>
+            </w:tcMar>
+            <w:vAlign w:val="center"/>
+          </w:tcPr>
+          <w:p>
+            <w:pPr>
+              <w:spacing w:after="0"/>
+            </w:pPr>
+            <w:r>
+              <w:rPr>
+                <w:rFonts w:ascii="Calibri" w:hAnsi="Calibri"/>
+                <w:b/>
+                <w:i w:val="0"/>
+                <w:color w:val="17324D"/>
+                <w:sz w:val="18"/>
+              </w:rPr>
+              <w:t>Experimental setup</w:t>
+            </w:r>
+          </w:p>
+        </w:tc>
+        <w:tc>
+          <w:tcPr>
+            <w:tcW w:type="dxa" w:w="7272"/>
+            <w:tcMar>
+              <w:top w:w="80" w:type="dxa"/>
+              <w:start w:w="120" w:type="dxa"/>
+              <w:bottom w:w="80" w:type="dxa"/>
+              <w:end w:w="120" w:type="dxa"/>
+            </w:tcMar>
+            <w:vAlign w:val="center"/>
+          </w:tcPr>
+          <w:p>
+            <w:pPr>
+              <w:spacing w:after="0"/>
+            </w:pPr>
+            <w:r>
+              <w:rPr>
+                <w:rFonts w:ascii="Calibri" w:hAnsi="Calibri"/>
+                <w:b w:val="0"/>
+                <w:i w:val="0"/>
+                <w:color w:val="000000"/>
+                <w:sz w:val="18"/>
+              </w:rPr>
+              <w:t>Harmonized laboratory and field evaluation with performance classes, including a class for non-regulatory applications; characterization here is limited to the published scope.</w:t>
+            </w:r>
+          </w:p>
+        </w:tc>
+      </w:tr>
+    </w:tbl>
+    <w:p>
+      <w:pPr>
+        <w:spacing w:after="0"/>
+      </w:pPr>
+    </w:p>
+    <w:p>
+      <w:pPr>
+        <w:keepNext w:val="0"/>
+        <w:spacing w:after="80" w:line="264" w:lineRule="auto"/>
+      </w:pPr>
+      <w:r>
+        <w:rPr>
+          <w:rFonts w:ascii="Calibri" w:hAnsi="Calibri"/>
+          <w:b/>
+          <w:i w:val="0"/>
+          <w:color w:val="000000"/>
+          <w:sz w:val="21"/>
+        </w:rPr>
+        <w:t xml:space="preserve">What it shows: </w:t>
+      </w:r>
+      <w:r>
+        <w:rPr>
+          <w:rFonts w:ascii="Calibri" w:hAnsi="Calibri"/>
+          <w:b w:val="0"/>
+          <w:i w:val="0"/>
+          <w:color w:val="000000"/>
+          <w:sz w:val="21"/>
+        </w:rPr>
+        <w:t>Performance classes offer a useful model for tiered acceptance thresholds rather than one universal pass/fail line.</w:t>
+      </w:r>
+    </w:p>
+    <w:p>
+      <w:pPr>
+        <w:keepNext w:val="0"/>
+        <w:spacing w:after="80" w:line="264" w:lineRule="auto"/>
+      </w:pPr>
+      <w:r>
+        <w:rPr>
+          <w:rFonts w:ascii="Calibri" w:hAnsi="Calibri"/>
+          <w:b/>
+          <w:i w:val="0"/>
+          <w:color w:val="000000"/>
+          <w:sz w:val="21"/>
+        </w:rPr>
+        <w:t xml:space="preserve">Brief conclusion: </w:t>
+      </w:r>
+      <w:r>
+        <w:rPr>
+          <w:rFonts w:ascii="Calibri" w:hAnsi="Calibri"/>
+          <w:b w:val="0"/>
+          <w:i w:val="0"/>
+          <w:color w:val="000000"/>
+          <w:sz w:val="21"/>
+        </w:rPr>
+        <w:t>The specification supports class-based gas-sensor evaluation but does not justify physical enclosure choices.</w:t>
+      </w:r>
+    </w:p>
+    <w:p>
+      <w:pPr>
+        <w:keepNext w:val="0"/>
+        <w:spacing w:after="60" w:line="264" w:lineRule="auto"/>
+      </w:pPr>
+      <w:r>
+        <w:rPr>
+          <w:rFonts w:ascii="Calibri" w:hAnsi="Calibri"/>
+          <w:b/>
+          <w:i w:val="0"/>
+          <w:color w:val="000000"/>
+          <w:sz w:val="21"/>
+        </w:rPr>
+        <w:t xml:space="preserve">Importance to this research: </w:t>
+      </w:r>
+      <w:r>
+        <w:rPr>
+          <w:rFonts w:ascii="Calibri" w:hAnsi="Calibri"/>
+          <w:b w:val="0"/>
+          <w:i w:val="0"/>
+          <w:color w:val="000000"/>
+          <w:sz w:val="21"/>
+        </w:rPr>
+        <w:t>Provides a European framework for tiered acceptance criteria for gaseous-pollutant channels.</w:t>
+      </w:r>
+    </w:p>
+    <w:p>
+      <w:pPr>
+        <w:keepNext/>
+        <w:spacing w:after="40" w:line="264" w:lineRule="auto"/>
+      </w:pPr>
+      <w:r>
+        <w:rPr>
+          <w:rFonts w:ascii="Calibri" w:hAnsi="Calibri"/>
+          <w:b/>
+          <w:i w:val="0"/>
+          <w:color w:val="000000"/>
+          <w:sz w:val="21"/>
+        </w:rPr>
+        <w:t>Things to consider moving forward</w:t>
+      </w:r>
+      <w:r>
+        <w:rPr>
+          <w:rFonts w:ascii="Calibri" w:hAnsi="Calibri"/>
+          <w:b w:val="0"/>
+          <w:i w:val="0"/>
+          <w:color w:val="000000"/>
+          <w:sz w:val="21"/>
+        </w:rPr>
+      </w:r>
+    </w:p>
+    <w:p>
+      <w:pPr>
+        <w:pStyle w:val="ListBullet"/>
+        <w:spacing w:after="40" w:line="259" w:lineRule="auto"/>
+      </w:pPr>
+      <w:r>
+        <w:rPr>
+          <w:rFonts w:ascii="Calibri" w:hAnsi="Calibri"/>
+          <w:b w:val="0"/>
+          <w:i w:val="0"/>
+          <w:color w:val="000000"/>
+          <w:sz w:val="20"/>
+        </w:rPr>
+        <w:t>Keep claims at scope level until the paywalled full specification is obtained and reviewed.</w:t>
+      </w:r>
+    </w:p>
+    <w:p>
+      <w:pPr>
+        <w:pStyle w:val="ListBullet"/>
+        <w:spacing w:after="40" w:line="259" w:lineRule="auto"/>
+      </w:pPr>
+      <w:r>
+        <w:rPr>
+          <w:rFonts w:ascii="Calibri" w:hAnsi="Calibri"/>
+          <w:b w:val="0"/>
+          <w:i w:val="0"/>
+          <w:color w:val="000000"/>
+          <w:sz w:val="20"/>
+        </w:rPr>
+        <w:t>Do not apply Part 1 gas criteria to PM or meteorological channels.</w:t>
+      </w:r>
+    </w:p>
+    <w:p>
+      <w:r>
+        <w:br w:type="page"/>
+      </w:r>
+    </w:p>
+    <w:p>
+      <w:pPr>
+        <w:pStyle w:val="Heading1"/>
+        <w:keepNext/>
+      </w:pPr>
+      <w:r>
+        <w:t>Additional Field-Reliability and Data-Yield Studies</w:t>
+      </w:r>
+    </w:p>
+    <w:p>
+      <w:pPr>
+        <w:keepNext w:val="0"/>
+        <w:spacing w:after="120" w:line="264" w:lineRule="auto"/>
+      </w:pPr>
+      <w:r>
+        <w:rPr>
+          <w:rFonts w:ascii="Calibri" w:hAnsi="Calibri"/>
+          <w:b w:val="0"/>
+          <w:i w:val="0"/>
+          <w:color w:val="667085"/>
+          <w:sz w:val="19"/>
+        </w:rPr>
+        <w:t>These three later additions strengthen the evidence for completeness, deployment documentation, unit variability, and failure analysis. Their enclosure details are not used beyond what was verified.</w:t>
+      </w:r>
+    </w:p>
+    <w:p>
+      <w:pPr>
+        <w:pStyle w:val="Heading2"/>
+        <w:keepNext/>
+      </w:pPr>
+      <w:r>
+        <w:t>24. Szewczyk et al. (2004)</w:t>
+      </w:r>
+    </w:p>
+    <w:p>
+      <w:pPr>
+        <w:keepNext/>
+        <w:spacing w:after="60" w:line="264" w:lineRule="auto"/>
+      </w:pPr>
+      <w:r>
+        <w:rPr>
+          <w:rFonts w:ascii="Calibri" w:hAnsi="Calibri"/>
+          <w:b w:val="0"/>
+          <w:i/>
+          <w:color w:val="17324D"/>
+          <w:sz w:val="22"/>
+        </w:rPr>
+        <w:t>An Analysis of a Large Scale Habitat Monitoring Application</w:t>
+      </w:r>
+    </w:p>
+    <w:p>
+      <w:pPr>
+        <w:keepNext/>
+        <w:spacing w:after="120" w:line="264" w:lineRule="auto"/>
+      </w:pPr>
+      <w:r>
+        <w:rPr>
+          <w:rFonts w:ascii="Calibri" w:hAnsi="Calibri"/>
+          <w:b w:val="0"/>
+          <w:i w:val="0"/>
+          <w:color w:val="667085"/>
+          <w:sz w:val="17"/>
+        </w:rPr>
+        <w:t>DOI: https://doi.org/10.1145/1031495.1031521</w:t>
+      </w:r>
+    </w:p>
+    <w:tbl>
+      <w:tblPr>
+        <w:tblStyle w:val="TableGrid"/>
+        <w:tblW w:type="auto" w:w="0"/>
+        <w:jc w:val="center"/>
+        <w:tblLayout w:type="fixed"/>
+        <w:tblLook w:firstColumn="1" w:firstRow="1" w:lastColumn="0" w:lastRow="0" w:noHBand="0" w:noVBand="1" w:val="04A0"/>
+      </w:tblPr>
+      <w:tblGrid>
+        <w:gridCol w:w="4939"/>
+        <w:gridCol w:w="4939"/>
+      </w:tblGrid>
+      <w:tr>
+        <w:tc>
+          <w:tcPr>
+            <w:tcW w:type="dxa" w:w="1944"/>
+            <w:shd w:fill="EAF2F8"/>
+            <w:tcMar>
+              <w:top w:w="80" w:type="dxa"/>
+              <w:start w:w="120" w:type="dxa"/>
+              <w:bottom w:w="80" w:type="dxa"/>
+              <w:end w:w="120" w:type="dxa"/>
+            </w:tcMar>
+            <w:vAlign w:val="center"/>
+          </w:tcPr>
+          <w:p>
+            <w:pPr>
+              <w:spacing w:after="0"/>
+            </w:pPr>
+            <w:r>
+              <w:rPr>
+                <w:rFonts w:ascii="Calibri" w:hAnsi="Calibri"/>
+                <w:b/>
+                <w:i w:val="0"/>
+                <w:color w:val="17324D"/>
+                <w:sz w:val="18"/>
+              </w:rPr>
+              <w:t>Sensors</w:t>
+            </w:r>
+          </w:p>
+        </w:tc>
+        <w:tc>
+          <w:tcPr>
+            <w:tcW w:type="dxa" w:w="7272"/>
+            <w:tcMar>
+              <w:top w:w="80" w:type="dxa"/>
+              <w:start w:w="120" w:type="dxa"/>
+              <w:bottom w:w="80" w:type="dxa"/>
+              <w:end w:w="120" w:type="dxa"/>
+            </w:tcMar>
+            <w:vAlign w:val="center"/>
+          </w:tcPr>
+          <w:p>
+            <w:pPr>
+              <w:spacing w:after="0"/>
+            </w:pPr>
+            <w:r>
+              <w:rPr>
+                <w:rFonts w:ascii="Calibri" w:hAnsi="Calibri"/>
+                <w:b w:val="0"/>
+                <w:i w:val="0"/>
+                <w:color w:val="000000"/>
+                <w:sz w:val="18"/>
+              </w:rPr>
+              <w:t>Habitat-monitoring motes with temperature, humidity, and light-class sensing; exact part numbers were not re-verified for this synthesis update.</w:t>
+            </w:r>
+          </w:p>
+        </w:tc>
+      </w:tr>
+      <w:tr>
+        <w:tc>
+          <w:tcPr>
+            <w:tcW w:type="dxa" w:w="1944"/>
+            <w:shd w:fill="EAF2F8"/>
+            <w:tcMar>
+              <w:top w:w="80" w:type="dxa"/>
+              <w:start w:w="120" w:type="dxa"/>
+              <w:bottom w:w="80" w:type="dxa"/>
+              <w:end w:w="120" w:type="dxa"/>
+            </w:tcMar>
+            <w:vAlign w:val="center"/>
+          </w:tcPr>
+          <w:p>
+            <w:pPr>
+              <w:spacing w:after="0"/>
+            </w:pPr>
+            <w:r>
+              <w:rPr>
+                <w:rFonts w:ascii="Calibri" w:hAnsi="Calibri"/>
+                <w:b/>
+                <w:i w:val="0"/>
+                <w:color w:val="17324D"/>
+                <w:sz w:val="18"/>
+              </w:rPr>
+              <w:t>Materials</w:t>
+            </w:r>
+          </w:p>
+        </w:tc>
+        <w:tc>
+          <w:tcPr>
+            <w:tcW w:type="dxa" w:w="7272"/>
+            <w:tcMar>
+              <w:top w:w="80" w:type="dxa"/>
+              <w:start w:w="120" w:type="dxa"/>
+              <w:bottom w:w="80" w:type="dxa"/>
+              <w:end w:w="120" w:type="dxa"/>
+            </w:tcMar>
+            <w:vAlign w:val="center"/>
+          </w:tcPr>
+          <w:p>
+            <w:pPr>
+              <w:spacing w:after="0"/>
+            </w:pPr>
+            <w:r>
+              <w:rPr>
+                <w:rFonts w:ascii="Calibri" w:hAnsi="Calibri"/>
+                <w:b w:val="0"/>
+                <w:i w:val="0"/>
+                <w:color w:val="000000"/>
+                <w:sz w:val="18"/>
+              </w:rPr>
+              <w:t>Weatherproofed mote packaging; detailed material and packaging information was not re-verified and is not used as enclosure evidence here.</w:t>
+            </w:r>
+          </w:p>
+        </w:tc>
+      </w:tr>
+      <w:tr>
+        <w:tc>
+          <w:tcPr>
+            <w:tcW w:type="dxa" w:w="1944"/>
+            <w:shd w:fill="EAF2F8"/>
+            <w:tcMar>
+              <w:top w:w="80" w:type="dxa"/>
+              <w:start w:w="120" w:type="dxa"/>
+              <w:bottom w:w="80" w:type="dxa"/>
+              <w:end w:w="120" w:type="dxa"/>
+            </w:tcMar>
+            <w:vAlign w:val="center"/>
+          </w:tcPr>
+          <w:p>
+            <w:pPr>
+              <w:spacing w:after="0"/>
+            </w:pPr>
+            <w:r>
+              <w:rPr>
+                <w:rFonts w:ascii="Calibri" w:hAnsi="Calibri"/>
+                <w:b/>
+                <w:i w:val="0"/>
+                <w:color w:val="17324D"/>
+                <w:sz w:val="18"/>
+              </w:rPr>
+              <w:t>Geometry</w:t>
+            </w:r>
+          </w:p>
+        </w:tc>
+        <w:tc>
+          <w:tcPr>
+            <w:tcW w:type="dxa" w:w="7272"/>
+            <w:tcMar>
+              <w:top w:w="80" w:type="dxa"/>
+              <w:start w:w="120" w:type="dxa"/>
+              <w:bottom w:w="80" w:type="dxa"/>
+              <w:end w:w="120" w:type="dxa"/>
+            </w:tcMar>
+            <w:vAlign w:val="center"/>
+          </w:tcPr>
+          <w:p>
+            <w:pPr>
+              <w:spacing w:after="0"/>
+            </w:pPr>
+            <w:r>
+              <w:rPr>
+                <w:rFonts w:ascii="Calibri" w:hAnsi="Calibri"/>
+                <w:b w:val="0"/>
+                <w:i w:val="0"/>
+                <w:color w:val="000000"/>
+                <w:sz w:val="18"/>
+              </w:rPr>
+              <w:t>Approximately 150 devices organized across single-hop and multi-hop network tiers; shield geometry was not a study variable.</w:t>
+            </w:r>
+          </w:p>
+        </w:tc>
+      </w:tr>
+      <w:tr>
+        <w:tc>
+          <w:tcPr>
+            <w:tcW w:type="dxa" w:w="1944"/>
+            <w:shd w:fill="EAF2F8"/>
+            <w:tcMar>
+              <w:top w:w="80" w:type="dxa"/>
+              <w:start w:w="120" w:type="dxa"/>
+              <w:bottom w:w="80" w:type="dxa"/>
+              <w:end w:w="120" w:type="dxa"/>
+            </w:tcMar>
+            <w:vAlign w:val="center"/>
+          </w:tcPr>
+          <w:p>
+            <w:pPr>
+              <w:spacing w:after="0"/>
+            </w:pPr>
+            <w:r>
+              <w:rPr>
+                <w:rFonts w:ascii="Calibri" w:hAnsi="Calibri"/>
+                <w:b/>
+                <w:i w:val="0"/>
+                <w:color w:val="17324D"/>
+                <w:sz w:val="18"/>
+              </w:rPr>
+              <w:t>Experimental setup</w:t>
+            </w:r>
+          </w:p>
+        </w:tc>
+        <w:tc>
+          <w:tcPr>
+            <w:tcW w:type="dxa" w:w="7272"/>
+            <w:tcMar>
+              <w:top w:w="80" w:type="dxa"/>
+              <w:start w:w="120" w:type="dxa"/>
+              <w:bottom w:w="80" w:type="dxa"/>
+              <w:end w:w="120" w:type="dxa"/>
+            </w:tcMar>
+            <w:vAlign w:val="center"/>
+          </w:tcPr>
+          <w:p>
+            <w:pPr>
+              <w:spacing w:after="0"/>
+            </w:pPr>
+            <w:r>
+              <w:rPr>
+                <w:rFonts w:ascii="Calibri" w:hAnsi="Calibri"/>
+                <w:b w:val="0"/>
+                <w:i w:val="0"/>
+                <w:color w:val="000000"/>
+                <w:sz w:val="18"/>
+              </w:rPr>
+              <w:t>Four-month Great Duck Island field deployment focused on lifetime, node mortality, reliability, and data yield.</w:t>
+            </w:r>
+          </w:p>
+        </w:tc>
+      </w:tr>
+    </w:tbl>
+    <w:p>
+      <w:pPr>
+        <w:spacing w:after="0"/>
+      </w:pPr>
+    </w:p>
+    <w:p>
+      <w:pPr>
+        <w:keepNext w:val="0"/>
+        <w:spacing w:after="80" w:line="264" w:lineRule="auto"/>
+      </w:pPr>
+      <w:r>
+        <w:rPr>
+          <w:rFonts w:ascii="Calibri" w:hAnsi="Calibri"/>
+          <w:b/>
+          <w:i w:val="0"/>
+          <w:color w:val="000000"/>
+          <w:sz w:val="21"/>
+        </w:rPr>
+        <w:t xml:space="preserve">What it shows: </w:t>
+      </w:r>
+      <w:r>
+        <w:rPr>
+          <w:rFonts w:ascii="Calibri" w:hAnsi="Calibri"/>
+          <w:b w:val="0"/>
+          <w:i w:val="0"/>
+          <w:color w:val="000000"/>
+          <w:sz w:val="21"/>
+        </w:rPr>
+        <w:t>Multi-month field studies should treat node mortality and usable data yield as primary results, not implementation footnotes.</w:t>
+      </w:r>
+    </w:p>
+    <w:p>
+      <w:pPr>
+        <w:keepNext w:val="0"/>
+        <w:spacing w:after="80" w:line="264" w:lineRule="auto"/>
+      </w:pPr>
+      <w:r>
+        <w:rPr>
+          <w:rFonts w:ascii="Calibri" w:hAnsi="Calibri"/>
+          <w:b/>
+          <w:i w:val="0"/>
+          <w:color w:val="000000"/>
+          <w:sz w:val="21"/>
+        </w:rPr>
+        <w:t xml:space="preserve">Brief conclusion: </w:t>
+      </w:r>
+      <w:r>
+        <w:rPr>
+          <w:rFonts w:ascii="Calibri" w:hAnsi="Calibri"/>
+          <w:b w:val="0"/>
+          <w:i w:val="0"/>
+          <w:color w:val="000000"/>
+          <w:sz w:val="21"/>
+        </w:rPr>
+        <w:t>Deployment reliability and completeness can limit scientific value even when individual sensors function as expected.</w:t>
+      </w:r>
+    </w:p>
+    <w:p>
+      <w:pPr>
+        <w:keepNext w:val="0"/>
+        <w:spacing w:after="60" w:line="264" w:lineRule="auto"/>
+      </w:pPr>
+      <w:r>
+        <w:rPr>
+          <w:rFonts w:ascii="Calibri" w:hAnsi="Calibri"/>
+          <w:b/>
+          <w:i w:val="0"/>
+          <w:color w:val="000000"/>
+          <w:sz w:val="21"/>
+        </w:rPr>
+        <w:t xml:space="preserve">Importance to this research: </w:t>
+      </w:r>
+      <w:r>
+        <w:rPr>
+          <w:rFonts w:ascii="Calibri" w:hAnsi="Calibri"/>
+          <w:b w:val="0"/>
+          <w:i w:val="0"/>
+          <w:color w:val="000000"/>
+          <w:sz w:val="21"/>
+        </w:rPr>
+        <w:t>Supports reporting uptime, data yield, and failure analysis as first-class results in the enclosure paper.</w:t>
+      </w:r>
+    </w:p>
+    <w:p>
+      <w:pPr>
+        <w:keepNext/>
+        <w:spacing w:after="40" w:line="264" w:lineRule="auto"/>
+      </w:pPr>
+      <w:r>
+        <w:rPr>
+          <w:rFonts w:ascii="Calibri" w:hAnsi="Calibri"/>
+          <w:b/>
+          <w:i w:val="0"/>
+          <w:color w:val="000000"/>
+          <w:sz w:val="21"/>
+        </w:rPr>
+        <w:t>Things to consider moving forward</w:t>
+      </w:r>
+      <w:r>
+        <w:rPr>
+          <w:rFonts w:ascii="Calibri" w:hAnsi="Calibri"/>
+          <w:b w:val="0"/>
+          <w:i w:val="0"/>
+          <w:color w:val="000000"/>
+          <w:sz w:val="21"/>
+        </w:rPr>
+      </w:r>
+    </w:p>
+    <w:p>
+      <w:pPr>
+        <w:pStyle w:val="ListBullet"/>
+        <w:spacing w:after="40" w:line="259" w:lineRule="auto"/>
+      </w:pPr>
+      <w:r>
+        <w:rPr>
+          <w:rFonts w:ascii="Calibri" w:hAnsi="Calibri"/>
+          <w:b w:val="0"/>
+          <w:i w:val="0"/>
+          <w:color w:val="000000"/>
+          <w:sz w:val="20"/>
+        </w:rPr>
+        <w:t>Separate deployment-phase failures from bench behavior and sensor-calibration error.</w:t>
+      </w:r>
+    </w:p>
+    <w:p>
+      <w:pPr>
+        <w:pStyle w:val="ListBullet"/>
+        <w:spacing w:after="40" w:line="259" w:lineRule="auto"/>
+      </w:pPr>
+      <w:r>
+        <w:rPr>
+          <w:rFonts w:ascii="Calibri" w:hAnsi="Calibri"/>
+          <w:b w:val="0"/>
+          <w:i w:val="0"/>
+          <w:color w:val="000000"/>
+          <w:sz w:val="20"/>
+        </w:rPr>
+        <w:t>Do not cite this paper for enclosure material or geometry choices without re-verifying the full packaging description.</w:t>
+      </w:r>
+    </w:p>
+    <w:p>
+      <w:pPr>
+        <w:pStyle w:val="Heading2"/>
+        <w:keepNext/>
+      </w:pPr>
+      <w:r>
+        <w:t>25. Barrenetxea et al. (2008)</w:t>
+      </w:r>
+    </w:p>
+    <w:p>
+      <w:pPr>
+        <w:keepNext/>
+        <w:spacing w:after="60" w:line="264" w:lineRule="auto"/>
+      </w:pPr>
+      <w:r>
+        <w:rPr>
+          <w:rFonts w:ascii="Calibri" w:hAnsi="Calibri"/>
+          <w:b w:val="0"/>
+          <w:i/>
+          <w:color w:val="17324D"/>
+          <w:sz w:val="22"/>
+        </w:rPr>
+        <w:t>The Hitchhiker's Guide to Successful Wireless Sensor Network Deployments</w:t>
+      </w:r>
+    </w:p>
+    <w:p>
+      <w:pPr>
+        <w:keepNext/>
+        <w:spacing w:after="120" w:line="264" w:lineRule="auto"/>
+      </w:pPr>
+      <w:r>
+        <w:rPr>
+          <w:rFonts w:ascii="Calibri" w:hAnsi="Calibri"/>
+          <w:b w:val="0"/>
+          <w:i w:val="0"/>
+          <w:color w:val="667085"/>
+          <w:sz w:val="17"/>
+        </w:rPr>
+        <w:t>DOI: https://doi.org/10.1145/1460412.1460418</w:t>
+      </w:r>
+    </w:p>
+    <w:tbl>
+      <w:tblPr>
+        <w:tblStyle w:val="TableGrid"/>
+        <w:tblW w:type="auto" w:w="0"/>
+        <w:jc w:val="center"/>
+        <w:tblLayout w:type="fixed"/>
+        <w:tblLook w:firstColumn="1" w:firstRow="1" w:lastColumn="0" w:lastRow="0" w:noHBand="0" w:noVBand="1" w:val="04A0"/>
+      </w:tblPr>
+      <w:tblGrid>
+        <w:gridCol w:w="4939"/>
+        <w:gridCol w:w="4939"/>
+      </w:tblGrid>
+      <w:tr>
+        <w:tc>
+          <w:tcPr>
+            <w:tcW w:type="dxa" w:w="1944"/>
+            <w:shd w:fill="EAF2F8"/>
+            <w:tcMar>
+              <w:top w:w="80" w:type="dxa"/>
+              <w:start w:w="120" w:type="dxa"/>
+              <w:bottom w:w="80" w:type="dxa"/>
+              <w:end w:w="120" w:type="dxa"/>
+            </w:tcMar>
+            <w:vAlign w:val="center"/>
+          </w:tcPr>
+          <w:p>
+            <w:pPr>
+              <w:spacing w:after="0"/>
+            </w:pPr>
+            <w:r>
+              <w:rPr>
+                <w:rFonts w:ascii="Calibri" w:hAnsi="Calibri"/>
+                <w:b/>
+                <w:i w:val="0"/>
+                <w:color w:val="17324D"/>
+                <w:sz w:val="18"/>
+              </w:rPr>
+              <w:t>Sensors</w:t>
+            </w:r>
+          </w:p>
+        </w:tc>
+        <w:tc>
+          <w:tcPr>
+            <w:tcW w:type="dxa" w:w="7272"/>
+            <w:tcMar>
+              <w:top w:w="80" w:type="dxa"/>
+              <w:start w:w="120" w:type="dxa"/>
+              <w:bottom w:w="80" w:type="dxa"/>
+              <w:end w:w="120" w:type="dxa"/>
+            </w:tcMar>
+            <w:vAlign w:val="center"/>
+          </w:tcPr>
+          <w:p>
+            <w:pPr>
+              <w:spacing w:after="0"/>
+            </w:pPr>
+            <w:r>
+              <w:rPr>
+                <w:rFonts w:ascii="Calibri" w:hAnsi="Calibri"/>
+                <w:b w:val="0"/>
+                <w:i w:val="0"/>
+                <w:color w:val="000000"/>
+                <w:sz w:val="18"/>
+              </w:rPr>
+              <w:t>SensorScope solar-powered environmental stations with a meteorological sensing suite; exact sensor models were not re-verified for this synthesis update.</w:t>
+            </w:r>
+          </w:p>
+        </w:tc>
+      </w:tr>
+      <w:tr>
+        <w:tc>
+          <w:tcPr>
+            <w:tcW w:type="dxa" w:w="1944"/>
+            <w:shd w:fill="EAF2F8"/>
+            <w:tcMar>
+              <w:top w:w="80" w:type="dxa"/>
+              <w:start w:w="120" w:type="dxa"/>
+              <w:bottom w:w="80" w:type="dxa"/>
+              <w:end w:w="120" w:type="dxa"/>
+            </w:tcMar>
+            <w:vAlign w:val="center"/>
+          </w:tcPr>
+          <w:p>
+            <w:pPr>
+              <w:spacing w:after="0"/>
+            </w:pPr>
+            <w:r>
+              <w:rPr>
+                <w:rFonts w:ascii="Calibri" w:hAnsi="Calibri"/>
+                <w:b/>
+                <w:i w:val="0"/>
+                <w:color w:val="17324D"/>
+                <w:sz w:val="18"/>
+              </w:rPr>
+              <w:t>Materials</w:t>
+            </w:r>
+          </w:p>
+        </w:tc>
+        <w:tc>
+          <w:tcPr>
+            <w:tcW w:type="dxa" w:w="7272"/>
+            <w:tcMar>
+              <w:top w:w="80" w:type="dxa"/>
+              <w:start w:w="120" w:type="dxa"/>
+              <w:bottom w:w="80" w:type="dxa"/>
+              <w:end w:w="120" w:type="dxa"/>
+            </w:tcMar>
+            <w:vAlign w:val="center"/>
+          </w:tcPr>
+          <w:p>
+            <w:pPr>
+              <w:spacing w:after="0"/>
+            </w:pPr>
+            <w:r>
+              <w:rPr>
+                <w:rFonts w:ascii="Calibri" w:hAnsi="Calibri"/>
+                <w:b w:val="0"/>
+                <w:i w:val="0"/>
+                <w:color w:val="000000"/>
+                <w:sz w:val="18"/>
+              </w:rPr>
+              <w:t>Mast-mounted station packaging; detailed materials were not re-verified and are not used as enclosure evidence here.</w:t>
+            </w:r>
+          </w:p>
+        </w:tc>
+      </w:tr>
+      <w:tr>
+        <w:tc>
+          <w:tcPr>
+            <w:tcW w:type="dxa" w:w="1944"/>
+            <w:shd w:fill="EAF2F8"/>
+            <w:tcMar>
+              <w:top w:w="80" w:type="dxa"/>
+              <w:start w:w="120" w:type="dxa"/>
+              <w:bottom w:w="80" w:type="dxa"/>
+              <w:end w:w="120" w:type="dxa"/>
+            </w:tcMar>
+            <w:vAlign w:val="center"/>
+          </w:tcPr>
+          <w:p>
+            <w:pPr>
+              <w:spacing w:after="0"/>
+            </w:pPr>
+            <w:r>
+              <w:rPr>
+                <w:rFonts w:ascii="Calibri" w:hAnsi="Calibri"/>
+                <w:b/>
+                <w:i w:val="0"/>
+                <w:color w:val="17324D"/>
+                <w:sz w:val="18"/>
+              </w:rPr>
+              <w:t>Geometry</w:t>
+            </w:r>
+          </w:p>
+        </w:tc>
+        <w:tc>
+          <w:tcPr>
+            <w:tcW w:type="dxa" w:w="7272"/>
+            <w:tcMar>
+              <w:top w:w="80" w:type="dxa"/>
+              <w:start w:w="120" w:type="dxa"/>
+              <w:bottom w:w="80" w:type="dxa"/>
+              <w:end w:w="120" w:type="dxa"/>
+            </w:tcMar>
+            <w:vAlign w:val="center"/>
+          </w:tcPr>
+          <w:p>
+            <w:pPr>
+              <w:spacing w:after="0"/>
+            </w:pPr>
+            <w:r>
+              <w:rPr>
+                <w:rFonts w:ascii="Calibri" w:hAnsi="Calibri"/>
+                <w:b w:val="0"/>
+                <w:i w:val="0"/>
+                <w:color w:val="000000"/>
+                <w:sz w:val="18"/>
+              </w:rPr>
+              <w:t>Distributed outdoor stations used across multiple campaigns; enclosure thermal geometry was not isolated experimentally.</w:t>
+            </w:r>
+          </w:p>
+        </w:tc>
+      </w:tr>
+      <w:tr>
+        <w:tc>
+          <w:tcPr>
+            <w:tcW w:type="dxa" w:w="1944"/>
+            <w:shd w:fill="EAF2F8"/>
+            <w:tcMar>
+              <w:top w:w="80" w:type="dxa"/>
+              <w:start w:w="120" w:type="dxa"/>
+              <w:bottom w:w="80" w:type="dxa"/>
+              <w:end w:w="120" w:type="dxa"/>
+            </w:tcMar>
+            <w:vAlign w:val="center"/>
+          </w:tcPr>
+          <w:p>
+            <w:pPr>
+              <w:spacing w:after="0"/>
+            </w:pPr>
+            <w:r>
+              <w:rPr>
+                <w:rFonts w:ascii="Calibri" w:hAnsi="Calibri"/>
+                <w:b/>
+                <w:i w:val="0"/>
+                <w:color w:val="17324D"/>
+                <w:sz w:val="18"/>
+              </w:rPr>
+              <w:t>Experimental setup</w:t>
+            </w:r>
+          </w:p>
+        </w:tc>
+        <w:tc>
+          <w:tcPr>
+            <w:tcW w:type="dxa" w:w="7272"/>
+            <w:tcMar>
+              <w:top w:w="80" w:type="dxa"/>
+              <w:start w:w="120" w:type="dxa"/>
+              <w:bottom w:w="80" w:type="dxa"/>
+              <w:end w:w="120" w:type="dxa"/>
+            </w:tcMar>
+            <w:vAlign w:val="center"/>
+          </w:tcPr>
+          <w:p>
+            <w:pPr>
+              <w:spacing w:after="0"/>
+            </w:pPr>
+            <w:r>
+              <w:rPr>
+                <w:rFonts w:ascii="Calibri" w:hAnsi="Calibri"/>
+                <w:b w:val="0"/>
+                <w:i w:val="0"/>
+                <w:color w:val="000000"/>
+                <w:sz w:val="18"/>
+              </w:rPr>
+              <w:t>Experience and methodology synthesis drawn from repeated SensorScope environmental-monitoring campaigns.</w:t>
+            </w:r>
+          </w:p>
+        </w:tc>
+      </w:tr>
+    </w:tbl>
+    <w:p>
+      <w:pPr>
+        <w:spacing w:after="0"/>
+      </w:pPr>
+    </w:p>
+    <w:p>
+      <w:pPr>
+        <w:keepNext w:val="0"/>
+        <w:spacing w:after="80" w:line="264" w:lineRule="auto"/>
+      </w:pPr>
+      <w:r>
+        <w:rPr>
+          <w:rFonts w:ascii="Calibri" w:hAnsi="Calibri"/>
+          <w:b/>
+          <w:i w:val="0"/>
+          <w:color w:val="000000"/>
+          <w:sz w:val="21"/>
+        </w:rPr>
+        <w:t xml:space="preserve">What it shows: </w:t>
+      </w:r>
+      <w:r>
+        <w:rPr>
+          <w:rFonts w:ascii="Calibri" w:hAnsi="Calibri"/>
+          <w:b w:val="0"/>
+          <w:i w:val="0"/>
+          <w:color w:val="000000"/>
+          <w:sz w:val="21"/>
+        </w:rPr>
+        <w:t>A technically functioning network does not guarantee meaningful data; deployment problems span development, packaging, power, and on-site validation.</w:t>
+      </w:r>
+    </w:p>
+    <w:p>
+      <w:pPr>
+        <w:keepNext w:val="0"/>
+        <w:spacing w:after="80" w:line="264" w:lineRule="auto"/>
+      </w:pPr>
+      <w:r>
+        <w:rPr>
+          <w:rFonts w:ascii="Calibri" w:hAnsi="Calibri"/>
+          <w:b/>
+          <w:i w:val="0"/>
+          <w:color w:val="000000"/>
+          <w:sz w:val="21"/>
+        </w:rPr>
+        <w:t xml:space="preserve">Brief conclusion: </w:t>
+      </w:r>
+      <w:r>
+        <w:rPr>
+          <w:rFonts w:ascii="Calibri" w:hAnsi="Calibri"/>
+          <w:b w:val="0"/>
+          <w:i w:val="0"/>
+          <w:color w:val="000000"/>
+          <w:sz w:val="21"/>
+        </w:rPr>
+        <w:t>Protocol discipline and field-realistic pre-deployment checks are essential to interpreting sensor-network results.</w:t>
+      </w:r>
+    </w:p>
+    <w:p>
+      <w:pPr>
+        <w:keepNext w:val="0"/>
+        <w:spacing w:after="60" w:line="264" w:lineRule="auto"/>
+      </w:pPr>
+      <w:r>
+        <w:rPr>
+          <w:rFonts w:ascii="Calibri" w:hAnsi="Calibri"/>
+          <w:b/>
+          <w:i w:val="0"/>
+          <w:color w:val="000000"/>
+          <w:sz w:val="21"/>
+        </w:rPr>
+        <w:t xml:space="preserve">Importance to this research: </w:t>
+      </w:r>
+      <w:r>
+        <w:rPr>
+          <w:rFonts w:ascii="Calibri" w:hAnsi="Calibri"/>
+          <w:b w:val="0"/>
+          <w:i w:val="0"/>
+          <w:color w:val="000000"/>
+          <w:sz w:val="21"/>
+        </w:rPr>
+        <w:t>Supports documenting placement, retrieval, power configuration, maintenance, and validation rather than reconstructing the deployment timeline afterward.</w:t>
+      </w:r>
+    </w:p>
+    <w:p>
+      <w:pPr>
+        <w:keepNext/>
+        <w:spacing w:after="40" w:line="264" w:lineRule="auto"/>
+      </w:pPr>
+      <w:r>
+        <w:rPr>
+          <w:rFonts w:ascii="Calibri" w:hAnsi="Calibri"/>
+          <w:b/>
+          <w:i w:val="0"/>
+          <w:color w:val="000000"/>
+          <w:sz w:val="21"/>
+        </w:rPr>
+        <w:t>Things to consider moving forward</w:t>
+      </w:r>
+      <w:r>
+        <w:rPr>
+          <w:rFonts w:ascii="Calibri" w:hAnsi="Calibri"/>
+          <w:b w:val="0"/>
+          <w:i w:val="0"/>
+          <w:color w:val="000000"/>
+          <w:sz w:val="21"/>
+        </w:rPr>
+      </w:r>
+    </w:p>
+    <w:p>
+      <w:pPr>
+        <w:pStyle w:val="ListBullet"/>
+        <w:spacing w:after="40" w:line="259" w:lineRule="auto"/>
+      </w:pPr>
+      <w:r>
+        <w:rPr>
+          <w:rFonts w:ascii="Calibri" w:hAnsi="Calibri"/>
+          <w:b w:val="0"/>
+          <w:i w:val="0"/>
+          <w:color w:val="000000"/>
+          <w:sz w:val="20"/>
+        </w:rPr>
+        <w:t>Bench-test the complete system under the same power and communication conditions expected in the field.</w:t>
+      </w:r>
+    </w:p>
+    <w:p>
+      <w:pPr>
+        <w:pStyle w:val="ListBullet"/>
+        <w:spacing w:after="40" w:line="259" w:lineRule="auto"/>
+      </w:pPr>
+      <w:r>
+        <w:rPr>
+          <w:rFonts w:ascii="Calibri" w:hAnsi="Calibri"/>
+          <w:b w:val="0"/>
+          <w:i w:val="0"/>
+          <w:color w:val="000000"/>
+          <w:sz w:val="20"/>
+        </w:rPr>
+        <w:t>Do not cite this source as direct evidence for shield geometry or material selection.</w:t>
+      </w:r>
+    </w:p>
+    <w:p>
+      <w:pPr>
+        <w:pStyle w:val="Heading2"/>
+        <w:keepNext/>
+      </w:pPr>
+      <w:r>
+        <w:t>26. Feinberg et al. (2018)</w:t>
+      </w:r>
+    </w:p>
+    <w:p>
+      <w:pPr>
+        <w:keepNext/>
+        <w:spacing w:after="60" w:line="264" w:lineRule="auto"/>
+      </w:pPr>
+      <w:r>
+        <w:rPr>
+          <w:rFonts w:ascii="Calibri" w:hAnsi="Calibri"/>
+          <w:b w:val="0"/>
+          <w:i/>
+          <w:color w:val="17324D"/>
+          <w:sz w:val="22"/>
+        </w:rPr>
+        <w:t>Long-Term Evaluation of Air Sensor Technology under Ambient Conditions in Denver, Colorado</w:t>
+      </w:r>
+    </w:p>
+    <w:p>
+      <w:pPr>
+        <w:keepNext/>
+        <w:spacing w:after="120" w:line="264" w:lineRule="auto"/>
+      </w:pPr>
+      <w:r>
+        <w:rPr>
+          <w:rFonts w:ascii="Calibri" w:hAnsi="Calibri"/>
+          <w:b w:val="0"/>
+          <w:i w:val="0"/>
+          <w:color w:val="667085"/>
+          <w:sz w:val="17"/>
+        </w:rPr>
+        <w:t>DOI: https://doi.org/10.5194/amt-11-4605-2018</w:t>
+      </w:r>
+    </w:p>
+    <w:tbl>
+      <w:tblPr>
+        <w:tblStyle w:val="TableGrid"/>
+        <w:tblW w:type="auto" w:w="0"/>
+        <w:jc w:val="center"/>
+        <w:tblLayout w:type="fixed"/>
+        <w:tblLook w:firstColumn="1" w:firstRow="1" w:lastColumn="0" w:lastRow="0" w:noHBand="0" w:noVBand="1" w:val="04A0"/>
+      </w:tblPr>
+      <w:tblGrid>
+        <w:gridCol w:w="4939"/>
+        <w:gridCol w:w="4939"/>
+      </w:tblGrid>
+      <w:tr>
+        <w:tc>
+          <w:tcPr>
+            <w:tcW w:type="dxa" w:w="1944"/>
+            <w:shd w:fill="EAF2F8"/>
+            <w:tcMar>
+              <w:top w:w="80" w:type="dxa"/>
+              <w:start w:w="120" w:type="dxa"/>
+              <w:bottom w:w="80" w:type="dxa"/>
+              <w:end w:w="120" w:type="dxa"/>
+            </w:tcMar>
+            <w:vAlign w:val="center"/>
+          </w:tcPr>
+          <w:p>
+            <w:pPr>
+              <w:spacing w:after="0"/>
+            </w:pPr>
+            <w:r>
+              <w:rPr>
+                <w:rFonts w:ascii="Calibri" w:hAnsi="Calibri"/>
+                <w:b/>
+                <w:i w:val="0"/>
+                <w:color w:val="17324D"/>
+                <w:sz w:val="18"/>
+              </w:rPr>
+              <w:t>Sensors</w:t>
+            </w:r>
+          </w:p>
+        </w:tc>
+        <w:tc>
+          <w:tcPr>
+            <w:tcW w:type="dxa" w:w="7272"/>
+            <w:tcMar>
+              <w:top w:w="80" w:type="dxa"/>
+              <w:start w:w="120" w:type="dxa"/>
+              <w:bottom w:w="80" w:type="dxa"/>
+              <w:end w:w="120" w:type="dxa"/>
+            </w:tcMar>
+            <w:vAlign w:val="center"/>
+          </w:tcPr>
+          <w:p>
+            <w:pPr>
+              <w:spacing w:after="0"/>
+            </w:pPr>
+            <w:r>
+              <w:rPr>
+                <w:rFonts w:ascii="Calibri" w:hAnsi="Calibri"/>
+                <w:b w:val="0"/>
+                <w:i w:val="0"/>
+                <w:color w:val="000000"/>
+                <w:sz w:val="18"/>
+              </w:rPr>
+              <w:t>Commercial low-cost PM, ozone, and NO2 sensor packages deployed in triplicate against FEM monitors; model-level details were not re-verified for this update.</w:t>
+            </w:r>
+          </w:p>
+        </w:tc>
+      </w:tr>
+      <w:tr>
+        <w:tc>
+          <w:tcPr>
+            <w:tcW w:type="dxa" w:w="1944"/>
+            <w:shd w:fill="EAF2F8"/>
+            <w:tcMar>
+              <w:top w:w="80" w:type="dxa"/>
+              <w:start w:w="120" w:type="dxa"/>
+              <w:bottom w:w="80" w:type="dxa"/>
+              <w:end w:w="120" w:type="dxa"/>
+            </w:tcMar>
+            <w:vAlign w:val="center"/>
+          </w:tcPr>
+          <w:p>
+            <w:pPr>
+              <w:spacing w:after="0"/>
+            </w:pPr>
+            <w:r>
+              <w:rPr>
+                <w:rFonts w:ascii="Calibri" w:hAnsi="Calibri"/>
+                <w:b/>
+                <w:i w:val="0"/>
+                <w:color w:val="17324D"/>
+                <w:sz w:val="18"/>
+              </w:rPr>
+              <w:t>Materials</w:t>
+            </w:r>
+          </w:p>
+        </w:tc>
+        <w:tc>
+          <w:tcPr>
+            <w:tcW w:type="dxa" w:w="7272"/>
+            <w:tcMar>
+              <w:top w:w="80" w:type="dxa"/>
+              <w:start w:w="120" w:type="dxa"/>
+              <w:bottom w:w="80" w:type="dxa"/>
+              <w:end w:w="120" w:type="dxa"/>
+            </w:tcMar>
+            <w:vAlign w:val="center"/>
+          </w:tcPr>
+          <w:p>
+            <w:pPr>
+              <w:spacing w:after="0"/>
+            </w:pPr>
+            <w:r>
+              <w:rPr>
+                <w:rFonts w:ascii="Calibri" w:hAnsi="Calibri"/>
+                <w:b w:val="0"/>
+                <w:i w:val="0"/>
+                <w:color w:val="000000"/>
+                <w:sz w:val="18"/>
+              </w:rPr>
+              <w:t>Manufacturer-supplied sensor-package enclosures; enclosure construction was not re-verified and was not an isolated study variable.</w:t>
+            </w:r>
+          </w:p>
+        </w:tc>
+      </w:tr>
+      <w:tr>
+        <w:tc>
+          <w:tcPr>
+            <w:tcW w:type="dxa" w:w="1944"/>
+            <w:shd w:fill="EAF2F8"/>
+            <w:tcMar>
+              <w:top w:w="80" w:type="dxa"/>
+              <w:start w:w="120" w:type="dxa"/>
+              <w:bottom w:w="80" w:type="dxa"/>
+              <w:end w:w="120" w:type="dxa"/>
+            </w:tcMar>
+            <w:vAlign w:val="center"/>
+          </w:tcPr>
+          <w:p>
+            <w:pPr>
+              <w:spacing w:after="0"/>
+            </w:pPr>
+            <w:r>
+              <w:rPr>
+                <w:rFonts w:ascii="Calibri" w:hAnsi="Calibri"/>
+                <w:b/>
+                <w:i w:val="0"/>
+                <w:color w:val="17324D"/>
+                <w:sz w:val="18"/>
+              </w:rPr>
+              <w:t>Geometry</w:t>
+            </w:r>
+          </w:p>
+        </w:tc>
+        <w:tc>
+          <w:tcPr>
+            <w:tcW w:type="dxa" w:w="7272"/>
+            <w:tcMar>
+              <w:top w:w="80" w:type="dxa"/>
+              <w:start w:w="120" w:type="dxa"/>
+              <w:bottom w:w="80" w:type="dxa"/>
+              <w:end w:w="120" w:type="dxa"/>
+            </w:tcMar>
+            <w:vAlign w:val="center"/>
+          </w:tcPr>
+          <w:p>
+            <w:pPr>
+              <w:spacing w:after="0"/>
+            </w:pPr>
+            <w:r>
+              <w:rPr>
+                <w:rFonts w:ascii="Calibri" w:hAnsi="Calibri"/>
+                <w:b w:val="0"/>
+                <w:i w:val="0"/>
+                <w:color w:val="000000"/>
+                <w:sz w:val="18"/>
+              </w:rPr>
+              <w:t>Triplicate packages co-located at an urban regulatory monitoring site.</w:t>
+            </w:r>
+          </w:p>
+        </w:tc>
+      </w:tr>
+      <w:tr>
+        <w:tc>
+          <w:tcPr>
+            <w:tcW w:type="dxa" w:w="1944"/>
+            <w:shd w:fill="EAF2F8"/>
+            <w:tcMar>
+              <w:top w:w="80" w:type="dxa"/>
+              <w:start w:w="120" w:type="dxa"/>
+              <w:bottom w:w="80" w:type="dxa"/>
+              <w:end w:w="120" w:type="dxa"/>
+            </w:tcMar>
+            <w:vAlign w:val="center"/>
+          </w:tcPr>
+          <w:p>
+            <w:pPr>
+              <w:spacing w:after="0"/>
+            </w:pPr>
+            <w:r>
+              <w:rPr>
+                <w:rFonts w:ascii="Calibri" w:hAnsi="Calibri"/>
+                <w:b/>
+                <w:i w:val="0"/>
+                <w:color w:val="17324D"/>
+                <w:sz w:val="18"/>
+              </w:rPr>
+              <w:t>Experimental setup</w:t>
+            </w:r>
+          </w:p>
+        </w:tc>
+        <w:tc>
+          <w:tcPr>
+            <w:tcW w:type="dxa" w:w="7272"/>
+            <w:tcMar>
+              <w:top w:w="80" w:type="dxa"/>
+              <w:start w:w="120" w:type="dxa"/>
+              <w:bottom w:w="80" w:type="dxa"/>
+              <w:end w:w="120" w:type="dxa"/>
+            </w:tcMar>
+            <w:vAlign w:val="center"/>
+          </w:tcPr>
+          <w:p>
+            <w:pPr>
+              <w:spacing w:after="0"/>
+            </w:pPr>
+            <w:r>
+              <w:rPr>
+                <w:rFonts w:ascii="Calibri" w:hAnsi="Calibri"/>
+                <w:b w:val="0"/>
+                <w:i w:val="0"/>
+                <w:color w:val="000000"/>
+                <w:sz w:val="18"/>
+              </w:rPr>
+              <w:t>Seven-month Denver field evaluation spanning seasonal conditions and comparing completeness, correlation, and trend reproduction with FEM references.</w:t>
+            </w:r>
+          </w:p>
+        </w:tc>
+      </w:tr>
+    </w:tbl>
+    <w:p>
+      <w:pPr>
+        <w:spacing w:after="0"/>
+      </w:pPr>
+    </w:p>
+    <w:p>
+      <w:pPr>
+        <w:keepNext w:val="0"/>
+        <w:spacing w:after="80" w:line="264" w:lineRule="auto"/>
+      </w:pPr>
+      <w:r>
+        <w:rPr>
+          <w:rFonts w:ascii="Calibri" w:hAnsi="Calibri"/>
+          <w:b/>
+          <w:i w:val="0"/>
+          <w:color w:val="000000"/>
+          <w:sz w:val="21"/>
+        </w:rPr>
+        <w:t xml:space="preserve">What it shows: </w:t>
+      </w:r>
+      <w:r>
+        <w:rPr>
+          <w:rFonts w:ascii="Calibri" w:hAnsi="Calibri"/>
+          <w:b w:val="0"/>
+          <w:i w:val="0"/>
+          <w:color w:val="000000"/>
+          <w:sz w:val="21"/>
+        </w:rPr>
+        <w:t>Data completeness belongs beside accuracy as a long-term performance metric, and triplicate units help expose unit-to-unit variability.</w:t>
+      </w:r>
+    </w:p>
+    <w:p>
+      <w:pPr>
+        <w:keepNext w:val="0"/>
+        <w:spacing w:after="80" w:line="264" w:lineRule="auto"/>
+      </w:pPr>
+      <w:r>
+        <w:rPr>
+          <w:rFonts w:ascii="Calibri" w:hAnsi="Calibri"/>
+          <w:b/>
+          <w:i w:val="0"/>
+          <w:color w:val="000000"/>
+          <w:sz w:val="21"/>
+        </w:rPr>
+        <w:t xml:space="preserve">Brief conclusion: </w:t>
+      </w:r>
+      <w:r>
+        <w:rPr>
+          <w:rFonts w:ascii="Calibri" w:hAnsi="Calibri"/>
+          <w:b w:val="0"/>
+          <w:i w:val="0"/>
+          <w:color w:val="000000"/>
+          <w:sz w:val="21"/>
+        </w:rPr>
+        <w:t>A long deployment can reveal completeness and repeatability limits that a short calibration exercise cannot.</w:t>
+      </w:r>
+    </w:p>
+    <w:p>
+      <w:pPr>
+        <w:keepNext w:val="0"/>
+        <w:spacing w:after="60" w:line="264" w:lineRule="auto"/>
+      </w:pPr>
+      <w:r>
+        <w:rPr>
+          <w:rFonts w:ascii="Calibri" w:hAnsi="Calibri"/>
+          <w:b/>
+          <w:i w:val="0"/>
+          <w:color w:val="000000"/>
+          <w:sz w:val="21"/>
+        </w:rPr>
+        <w:t xml:space="preserve">Importance to this research: </w:t>
+      </w:r>
+      <w:r>
+        <w:rPr>
+          <w:rFonts w:ascii="Calibri" w:hAnsi="Calibri"/>
+          <w:b w:val="0"/>
+          <w:i w:val="0"/>
+          <w:color w:val="000000"/>
+          <w:sz w:val="21"/>
+        </w:rPr>
+        <w:t>Directly supports the manuscript's completeness analysis and the need to establish whether deployment logs represent separate units.</w:t>
+      </w:r>
+    </w:p>
+    <w:p>
+      <w:pPr>
+        <w:keepNext/>
+        <w:spacing w:after="40" w:line="264" w:lineRule="auto"/>
+      </w:pPr>
+      <w:r>
+        <w:rPr>
+          <w:rFonts w:ascii="Calibri" w:hAnsi="Calibri"/>
+          <w:b/>
+          <w:i w:val="0"/>
+          <w:color w:val="000000"/>
+          <w:sz w:val="21"/>
+        </w:rPr>
+        <w:t>Things to consider moving forward</w:t>
+      </w:r>
+      <w:r>
+        <w:rPr>
+          <w:rFonts w:ascii="Calibri" w:hAnsi="Calibri"/>
+          <w:b w:val="0"/>
+          <w:i w:val="0"/>
+          <w:color w:val="000000"/>
+          <w:sz w:val="21"/>
+        </w:rPr>
+      </w:r>
+    </w:p>
+    <w:p>
+      <w:pPr>
+        <w:pStyle w:val="ListBullet"/>
+        <w:spacing w:after="40" w:line="259" w:lineRule="auto"/>
+      </w:pPr>
+      <w:r>
+        <w:rPr>
+          <w:rFonts w:ascii="Calibri" w:hAnsi="Calibri"/>
+          <w:b w:val="0"/>
+          <w:i w:val="0"/>
+          <w:color w:val="000000"/>
+          <w:sz w:val="20"/>
+        </w:rPr>
+        <w:t>Deploy more than one identical unit when possible to bound unit-to-unit variability.</w:t>
+      </w:r>
+    </w:p>
+    <w:p>
+      <w:pPr>
+        <w:pStyle w:val="ListBullet"/>
+        <w:spacing w:after="40" w:line="259" w:lineRule="auto"/>
+      </w:pPr>
+      <w:r>
+        <w:rPr>
+          <w:rFonts w:ascii="Calibri" w:hAnsi="Calibri"/>
+          <w:b w:val="0"/>
+          <w:i w:val="0"/>
+          <w:color w:val="000000"/>
+          <w:sz w:val="20"/>
+        </w:rPr>
+        <w:t>Do not generalize Denver-specific performance values or infer enclosure effects that the study did not isolate.</w:t>
+      </w:r>
+    </w:p>
+    <w:p>
+      <w:r>
+        <w:br w:type="page"/>
+      </w:r>
+    </w:p>
+    <w:p>
+      <w:pPr>
+        <w:pStyle w:val="Heading1"/>
+        <w:keepNext/>
+      </w:pPr>
+      <w:r>
         <w:t>Recommended Experimental Framing</w:t>
       </w:r>
     </w:p>
@@ -11581,7 +15420,7 @@
           <w:color w:val="000000"/>
           <w:sz w:val="21"/>
         </w:rPr>
-        <w:t>Across the 19 sources, the strongest evidence supports a two-zone outdoor sensor-box architecture: protected electronics and power in a sealed, serviceable enclosure, with ambient sensors placed in an external or separately ventilated shield. A light-colored passive stacked-plate or cone shield is the most defensible low-power baseline. Active aspiration is valuable as an accuracy benchmark but must be evaluated against its power and maintenance cost. The paper should therefore report calibration improvement and physical-design performance together, while using observed intervention-free runtime and data completeness to define autonomy.</w:t>
+        <w:t>Across the 26 sources (22 research papers and four standards or protocols), the strongest evidence supports a two-zone outdoor sensor-box architecture: protected electronics and power in a sealed, serviceable enclosure, with ambient sensors placed in an external or separately ventilated shield. A light-colored passive stacked-plate or cone shield is the most defensible low-power baseline. Active aspiration is valuable as an accuracy benchmark but must be evaluated against its power and maintenance cost. The paper should therefore report calibration improvement and physical-design performance together, while using observed intervention-free runtime and data completeness to define autonomy.</w:t>
       </w:r>
     </w:p>
     <w:p>
@@ -11611,7 +15450,7 @@
     </w:p>
     <w:p>
       <w:pPr>
-        <w:spacing w:after="100" w:line="252" w:lineRule="auto"/>
+        <w:spacing w:after="60" w:line="252" w:lineRule="auto"/>
       </w:pPr>
       <w:r>
         <w:rPr>
@@ -11646,7 +15485,7 @@
     </w:p>
     <w:p>
       <w:pPr>
-        <w:spacing w:after="100" w:line="252" w:lineRule="auto"/>
+        <w:spacing w:after="60" w:line="252" w:lineRule="auto"/>
       </w:pPr>
       <w:r>
         <w:rPr>
@@ -11681,7 +15520,7 @@
     </w:p>
     <w:p>
       <w:pPr>
-        <w:spacing w:after="100" w:line="252" w:lineRule="auto"/>
+        <w:spacing w:after="60" w:line="252" w:lineRule="auto"/>
       </w:pPr>
       <w:r>
         <w:rPr>
@@ -11691,7 +15530,7 @@
           <w:color w:val="17324D"/>
           <w:sz w:val="18"/>
         </w:rPr>
-        <w:t xml:space="preserve">Grimsley et al. (2022). </w:t>
+        <w:t xml:space="preserve">Grimsley et al. (2021). </w:t>
       </w:r>
       <w:r>
         <w:rPr>
@@ -11716,7 +15555,7 @@
     </w:p>
     <w:p>
       <w:pPr>
-        <w:spacing w:after="100" w:line="252" w:lineRule="auto"/>
+        <w:spacing w:after="60" w:line="252" w:lineRule="auto"/>
       </w:pPr>
       <w:r>
         <w:rPr>
@@ -11751,7 +15590,7 @@
     </w:p>
     <w:p>
       <w:pPr>
-        <w:spacing w:after="100" w:line="252" w:lineRule="auto"/>
+        <w:spacing w:after="60" w:line="252" w:lineRule="auto"/>
       </w:pPr>
       <w:r>
         <w:rPr>
@@ -11786,7 +15625,7 @@
     </w:p>
     <w:p>
       <w:pPr>
-        <w:spacing w:after="100" w:line="252" w:lineRule="auto"/>
+        <w:spacing w:after="60" w:line="252" w:lineRule="auto"/>
       </w:pPr>
       <w:r>
         <w:rPr>
@@ -11821,7 +15660,7 @@
     </w:p>
     <w:p>
       <w:pPr>
-        <w:spacing w:after="100" w:line="252" w:lineRule="auto"/>
+        <w:spacing w:after="60" w:line="252" w:lineRule="auto"/>
       </w:pPr>
       <w:r>
         <w:rPr>
@@ -11856,7 +15695,7 @@
     </w:p>
     <w:p>
       <w:pPr>
-        <w:spacing w:after="100" w:line="252" w:lineRule="auto"/>
+        <w:spacing w:after="60" w:line="252" w:lineRule="auto"/>
       </w:pPr>
       <w:r>
         <w:rPr>
@@ -11891,7 +15730,7 @@
     </w:p>
     <w:p>
       <w:pPr>
-        <w:spacing w:after="100" w:line="252" w:lineRule="auto"/>
+        <w:spacing w:after="60" w:line="252" w:lineRule="auto"/>
       </w:pPr>
       <w:r>
         <w:rPr>
@@ -11926,7 +15765,7 @@
     </w:p>
     <w:p>
       <w:pPr>
-        <w:spacing w:after="100" w:line="252" w:lineRule="auto"/>
+        <w:spacing w:after="60" w:line="252" w:lineRule="auto"/>
       </w:pPr>
       <w:r>
         <w:rPr>
@@ -11961,7 +15800,7 @@
     </w:p>
     <w:p>
       <w:pPr>
-        <w:spacing w:after="100" w:line="252" w:lineRule="auto"/>
+        <w:spacing w:after="60" w:line="252" w:lineRule="auto"/>
       </w:pPr>
       <w:r>
         <w:rPr>
@@ -11996,7 +15835,7 @@
     </w:p>
     <w:p>
       <w:pPr>
-        <w:spacing w:after="100" w:line="252" w:lineRule="auto"/>
+        <w:spacing w:after="60" w:line="252" w:lineRule="auto"/>
       </w:pPr>
       <w:r>
         <w:rPr>
@@ -12031,7 +15870,7 @@
     </w:p>
     <w:p>
       <w:pPr>
-        <w:spacing w:after="100" w:line="252" w:lineRule="auto"/>
+        <w:spacing w:after="60" w:line="252" w:lineRule="auto"/>
       </w:pPr>
       <w:r>
         <w:rPr>
@@ -12066,7 +15905,7 @@
     </w:p>
     <w:p>
       <w:pPr>
-        <w:spacing w:after="100" w:line="252" w:lineRule="auto"/>
+        <w:spacing w:after="60" w:line="252" w:lineRule="auto"/>
       </w:pPr>
       <w:r>
         <w:rPr>
@@ -12101,7 +15940,7 @@
     </w:p>
     <w:p>
       <w:pPr>
-        <w:spacing w:after="100" w:line="252" w:lineRule="auto"/>
+        <w:spacing w:after="60" w:line="252" w:lineRule="auto"/>
       </w:pPr>
       <w:r>
         <w:rPr>
@@ -12136,7 +15975,7 @@
     </w:p>
     <w:p>
       <w:pPr>
-        <w:spacing w:after="100" w:line="252" w:lineRule="auto"/>
+        <w:spacing w:after="60" w:line="252" w:lineRule="auto"/>
       </w:pPr>
       <w:r>
         <w:rPr>
@@ -12171,7 +16010,7 @@
     </w:p>
     <w:p>
       <w:pPr>
-        <w:spacing w:after="100" w:line="252" w:lineRule="auto"/>
+        <w:spacing w:after="60" w:line="252" w:lineRule="auto"/>
       </w:pPr>
       <w:r>
         <w:rPr>
@@ -12206,7 +16045,7 @@
     </w:p>
     <w:p>
       <w:pPr>
-        <w:spacing w:after="100" w:line="252" w:lineRule="auto"/>
+        <w:spacing w:after="60" w:line="252" w:lineRule="auto"/>
       </w:pPr>
       <w:r>
         <w:rPr>
@@ -12241,7 +16080,7 @@
     </w:p>
     <w:p>
       <w:pPr>
-        <w:spacing w:after="100" w:line="252" w:lineRule="auto"/>
+        <w:spacing w:after="60" w:line="252" w:lineRule="auto"/>
       </w:pPr>
       <w:r>
         <w:rPr>
@@ -12272,6 +16111,251 @@
           <w:sz w:val="18"/>
         </w:rPr>
         <w:t>https://doi.org/10.1021/acssensors.5c00566</w:t>
+      </w:r>
+    </w:p>
+    <w:p>
+      <w:pPr>
+        <w:spacing w:after="60" w:line="252" w:lineRule="auto"/>
+      </w:pPr>
+      <w:r>
+        <w:rPr>
+          <w:rFonts w:ascii="Calibri" w:hAnsi="Calibri"/>
+          <w:b/>
+          <w:i w:val="0"/>
+          <w:color w:val="17324D"/>
+          <w:sz w:val="18"/>
+        </w:rPr>
+        <w:t xml:space="preserve">Duvall et al. (2021; EPA/600/R-20/280). </w:t>
+      </w:r>
+      <w:r>
+        <w:rPr>
+          <w:rFonts w:ascii="Calibri" w:hAnsi="Calibri"/>
+          <w:b w:val="0"/>
+          <w:i/>
+          <w:color w:val="000000"/>
+          <w:sz w:val="18"/>
+        </w:rPr>
+        <w:t xml:space="preserve">Performance Testing Protocols, Metrics, and Target Values for Fine Particulate Matter Air Sensors. </w:t>
+      </w:r>
+      <w:r>
+        <w:rPr>
+          <w:rFonts w:ascii="Calibri" w:hAnsi="Calibri"/>
+          <w:b w:val="0"/>
+          <w:i w:val="0"/>
+          <w:color w:val="1F4E79"/>
+          <w:sz w:val="18"/>
+        </w:rPr>
+        <w:t>https://cfpub.epa.gov/si/si_public_record_report.cfm?dirEntryId=350785</w:t>
+      </w:r>
+    </w:p>
+    <w:p>
+      <w:pPr>
+        <w:spacing w:after="60" w:line="252" w:lineRule="auto"/>
+      </w:pPr>
+      <w:r>
+        <w:rPr>
+          <w:rFonts w:ascii="Calibri" w:hAnsi="Calibri"/>
+          <w:b/>
+          <w:i w:val="0"/>
+          <w:color w:val="17324D"/>
+          <w:sz w:val="18"/>
+        </w:rPr>
+        <w:t xml:space="preserve">World Meteorological Organization (2023). </w:t>
+      </w:r>
+      <w:r>
+        <w:rPr>
+          <w:rFonts w:ascii="Calibri" w:hAnsi="Calibri"/>
+          <w:b w:val="0"/>
+          <w:i/>
+          <w:color w:val="000000"/>
+          <w:sz w:val="18"/>
+        </w:rPr>
+        <w:t xml:space="preserve">Guide to Instruments and Methods of Observation (WMO-No. 8), Volume I: Measurement of Meteorological Variables. </w:t>
+      </w:r>
+      <w:r>
+        <w:rPr>
+          <w:rFonts w:ascii="Calibri" w:hAnsi="Calibri"/>
+          <w:b w:val="0"/>
+          <w:i w:val="0"/>
+          <w:color w:val="1F4E79"/>
+          <w:sz w:val="18"/>
+        </w:rPr>
+        <w:t>https://library.wmo.int/records/item/68695-guide-to-instruments-and-methods-of-observation</w:t>
+      </w:r>
+    </w:p>
+    <w:p>
+      <w:pPr>
+        <w:spacing w:after="60" w:line="252" w:lineRule="auto"/>
+      </w:pPr>
+      <w:r>
+        <w:rPr>
+          <w:rFonts w:ascii="Calibri" w:hAnsi="Calibri"/>
+          <w:b/>
+          <w:i w:val="0"/>
+          <w:color w:val="17324D"/>
+          <w:sz w:val="18"/>
+        </w:rPr>
+        <w:t xml:space="preserve">ASTM International (2022). </w:t>
+      </w:r>
+      <w:r>
+        <w:rPr>
+          <w:rFonts w:ascii="Calibri" w:hAnsi="Calibri"/>
+          <w:b w:val="0"/>
+          <w:i/>
+          <w:color w:val="000000"/>
+          <w:sz w:val="18"/>
+        </w:rPr>
+        <w:t xml:space="preserve">ASTM D8406-22: Standard Practice for Performance Evaluation of Ambient Outdoor Air Quality Sensors and Sensor-Based Instruments for Portable and Fixed-Point Measurement. </w:t>
+      </w:r>
+      <w:r>
+        <w:rPr>
+          <w:rFonts w:ascii="Calibri" w:hAnsi="Calibri"/>
+          <w:b w:val="0"/>
+          <w:i w:val="0"/>
+          <w:color w:val="1F4E79"/>
+          <w:sz w:val="18"/>
+        </w:rPr>
+        <w:t>https://store.astm.org/d8406-22.html</w:t>
+      </w:r>
+    </w:p>
+    <w:p>
+      <w:pPr>
+        <w:spacing w:after="60" w:line="252" w:lineRule="auto"/>
+      </w:pPr>
+      <w:r>
+        <w:rPr>
+          <w:rFonts w:ascii="Calibri" w:hAnsi="Calibri"/>
+          <w:b/>
+          <w:i w:val="0"/>
+          <w:color w:val="17324D"/>
+          <w:sz w:val="18"/>
+        </w:rPr>
+        <w:t xml:space="preserve">European Committee for Standardization (2021). </w:t>
+      </w:r>
+      <w:r>
+        <w:rPr>
+          <w:rFonts w:ascii="Calibri" w:hAnsi="Calibri"/>
+          <w:b w:val="0"/>
+          <w:i/>
+          <w:color w:val="000000"/>
+          <w:sz w:val="18"/>
+        </w:rPr>
+        <w:t xml:space="preserve">CEN/TS 17660-1:2021: Air Quality—Performance Evaluation of Air Quality Sensor Systems—Part 1: Gaseous Pollutants in Ambient Air. </w:t>
+      </w:r>
+      <w:r>
+        <w:rPr>
+          <w:rFonts w:ascii="Calibri" w:hAnsi="Calibri"/>
+          <w:b w:val="0"/>
+          <w:i w:val="0"/>
+          <w:color w:val="1F4E79"/>
+          <w:sz w:val="18"/>
+        </w:rPr>
+        <w:t>https://standards.cencenelec.eu/dyn/www/f?p=205:110:0::::FSP_PROJECT:65599</w:t>
+      </w:r>
+    </w:p>
+    <w:p>
+      <w:pPr>
+        <w:spacing w:after="60" w:line="252" w:lineRule="auto"/>
+      </w:pPr>
+      <w:r>
+        <w:rPr>
+          <w:rFonts w:ascii="Calibri" w:hAnsi="Calibri"/>
+          <w:b/>
+          <w:i w:val="0"/>
+          <w:color w:val="17324D"/>
+          <w:sz w:val="18"/>
+        </w:rPr>
+        <w:t xml:space="preserve">Szewczyk et al. (2004). </w:t>
+      </w:r>
+      <w:r>
+        <w:rPr>
+          <w:rFonts w:ascii="Calibri" w:hAnsi="Calibri"/>
+          <w:b w:val="0"/>
+          <w:i/>
+          <w:color w:val="000000"/>
+          <w:sz w:val="18"/>
+        </w:rPr>
+        <w:t xml:space="preserve">An Analysis of a Large Scale Habitat Monitoring Application. </w:t>
+      </w:r>
+      <w:r>
+        <w:rPr>
+          <w:rFonts w:ascii="Calibri" w:hAnsi="Calibri"/>
+          <w:b w:val="0"/>
+          <w:i w:val="0"/>
+          <w:color w:val="1F4E79"/>
+          <w:sz w:val="18"/>
+        </w:rPr>
+        <w:t>https://doi.org/10.1145/1031495.1031521</w:t>
+      </w:r>
+    </w:p>
+    <w:p>
+      <w:pPr>
+        <w:spacing w:after="60" w:line="252" w:lineRule="auto"/>
+      </w:pPr>
+      <w:r>
+        <w:rPr>
+          <w:rFonts w:ascii="Calibri" w:hAnsi="Calibri"/>
+          <w:b/>
+          <w:i w:val="0"/>
+          <w:color w:val="17324D"/>
+          <w:sz w:val="18"/>
+        </w:rPr>
+        <w:t xml:space="preserve">Barrenetxea et al. (2008). </w:t>
+      </w:r>
+      <w:r>
+        <w:rPr>
+          <w:rFonts w:ascii="Calibri" w:hAnsi="Calibri"/>
+          <w:b w:val="0"/>
+          <w:i/>
+          <w:color w:val="000000"/>
+          <w:sz w:val="18"/>
+        </w:rPr>
+        <w:t xml:space="preserve">The Hitchhiker's Guide to Successful Wireless Sensor Network Deployments. </w:t>
+      </w:r>
+      <w:r>
+        <w:rPr>
+          <w:rFonts w:ascii="Calibri" w:hAnsi="Calibri"/>
+          <w:b w:val="0"/>
+          <w:i w:val="0"/>
+          <w:color w:val="1F4E79"/>
+          <w:sz w:val="18"/>
+        </w:rPr>
+        <w:t>https://doi.org/10.1145/1460412.1460418</w:t>
+      </w:r>
+    </w:p>
+    <w:p>
+      <w:pPr>
+        <w:spacing w:after="60" w:line="252" w:lineRule="auto"/>
+      </w:pPr>
+      <w:r>
+        <w:rPr>
+          <w:rFonts w:ascii="Calibri" w:hAnsi="Calibri"/>
+          <w:b/>
+          <w:i w:val="0"/>
+          <w:color w:val="17324D"/>
+          <w:sz w:val="18"/>
+        </w:rPr>
+        <w:t xml:space="preserve">Feinberg et al. (2018). </w:t>
+      </w:r>
+      <w:r>
+        <w:rPr>
+          <w:rFonts w:ascii="Calibri" w:hAnsi="Calibri"/>
+          <w:b w:val="0"/>
+          <w:i/>
+          <w:color w:val="000000"/>
+          <w:sz w:val="18"/>
+        </w:rPr>
+        <w:t xml:space="preserve">Long-Term Evaluation of Air Sensor Technology under Ambient Conditions in Denver, Colorado. </w:t>
+      </w:r>
+      <w:r>
+        <w:rPr>
+          <w:rFonts w:ascii="Calibri" w:hAnsi="Calibri"/>
+          <w:b w:val="0"/>
+          <w:i w:val="0"/>
+          <w:color w:val="1F4E79"/>
+          <w:sz w:val="18"/>
+        </w:rPr>
+        <w:t>https://doi.org/10.5194/amt-11-4605-2018</w:t>
       </w:r>
     </w:p>
     <w:sectPr>

</xml_diff>